<commit_message>
Follow Mina's research plan numbering and order; update notes, Gantt, deck, figures and links
</commit_message>
<xml_diff>
--- a/docs/notes/Mina_Project_Notes.docx
+++ b/docs/notes/Mina_Project_Notes.docx
@@ -267,7 +267,7 @@
       </w:r>
       <w:r>
         <w:rPr/>
-        <w:t xml:space="preserve">Concatenation + MLP is the floor; Coupled Mamba on the codon grid is priority 1 (interaction through the recurrence, nothing forces similarity); IsoFormer-style cross-attention is priority 2 (learns correspondence where there is no grid). The research plan adds the matched baselines: BioLangFusion reproduced exactly (its attention head is also the simple fusion baseline of Fusion or Confusion) and LucaOne (joint pretraining instead of fusion). Every design is scored against the reproduced heads on identical splits.</w:t>
+        <w:t>Concatenation + MLP is the floor; Coupled Mamba on the codon grid is architecture priority 1 (interaction through the recurrence, nothing forces similarity); IsoFormer-style cross-attention is architecture priority 2 (learns correspondence where there is no grid). The research plan's first two items add the matched baselines: BioLangFusion reproduced exactly (item 1; its attention head is also the simple fusion baseline of Fusion or Confusion) and LucaOne (item 2; joint pretraining instead of fusion). Every design is scored against the reproduced heads on identical splits.</w:t>
       </w:r>
     </w:p>
     <w:p>
@@ -287,7 +287,7 @@
       </w:r>
       <w:r>
         <w:rPr/>
-        <w:t xml:space="preserve">In order: baselines and controls (mRFP); the reproduction; Coupled Mamba against the reproduced heads; ablations (encoder swaps, alignment loss, grid); the task set, chosen so each dataset isolates one question; the method test, whether Stage 1 metrics predict Δfusion. The question "this RNA model with this DNA model for this task" is answered by encoder swaps under a fixed architecture across that task set; COMET adds multi-molecule tasks with published combinations and LucaOne as reference points, and mRNABench adds homology-aware splits. Fusion or Confusion's checklist (identical heads, tuned baselines, grouped cross-validation, mean ± SD, a statistical comparison) is the evaluation rule on every comparison. The Overleaf figure "The chain of stages" shows this on one page.</w:t>
+        <w:t>The research plan's seven items run in its order, on top of the design: (1) BioLangFusion reproduced exactly, then encoder swaps; (2) LucaOne; (3) full-transcript half-life; (4) translation efficiency; (5) the mRFP control; (6) structure, optional; (7) distillation, exploratory. Around them: baselines and controls; Coupled Mamba against the reproduced heads; ablations (alignment loss, grid); the task set, chosen so each dataset isolates one question; and the method test, whether Stage 1 metrics predict Δfusion. The question "this RNA model with this DNA model for this task" is answered by encoder swaps under a fixed architecture across that task set; COMET adds multi-molecule tasks with published combinations and LucaOne as reference points, and mRNABench adds homology-aware splits. Fusion or Confusion's checklist (identical heads, tuned baselines, grouped cross-validation, mean ± SD, a statistical comparison) is the evaluation rule on every comparison. The Overleaf figure "The chain of stages" shows this on one page.</w:t>
       </w:r>
     </w:p>
     <w:p>
@@ -479,7 +479,7 @@
       </w:r>
       <w:r>
         <w:rPr/>
-        <w:t xml:space="preserve">First actions: token-level embeddings for the twelve encoders; the BioLangFusion reproduction (Gantt 17); Coupled Mamba feasibility tests (20); cross-attention (25).</w:t>
+        <w:t>First actions: token-level embeddings for the twelve encoders; the BioLangFusion reproduction (Gantt 17); Coupled Mamba feasibility tests (20); cross-attention (25); the LucaOne input check (41).</w:t>
       </w:r>
     </w:p>
     <w:p>
@@ -499,7 +499,7 @@
       </w:r>
       <w:r>
         <w:rPr/>
-        <w:t xml:space="preserve">In order: baselines and controls (16, 18), the reproduction (17), Coupled Mamba against it (21), encoder swaps and the alignment-loss ablation (24, 23), LucaOne (41), synthesis (29), the full-transcript tasks (42); distillation to think about (43).</w:t>
+        <w:t>The research plan's seven items in its order, on top of the design: baselines with the mRFP control in parallel (16, 18), the BioLangFusion reproduction (17), the encoder swaps (24), LucaOne (41), alongside Coupled Mamba against the reproduced heads (20, 21) and the alignment-loss ablation (23); synthesis (29); then, conditional, half-life and translation efficiency (42), structure (38), and distillation (43).</w:t>
       </w:r>
     </w:p>
     <w:p>
@@ -745,7 +745,7 @@
       <w:proofErr w:type="spellEnd"/>
       <w:r>
         <w:rPr/>
-        <w:t xml:space="preserve">Coupled Mamba stays the priority architecture (Gantt IDs 20 and 21), with IsoFormer-style cross-attention second (ID 25). The research plan adds seven items to that design without replacing any of it: a faithful reproduction of BioLangFusion with its own encoders, codon grid, three heads, TextCNN head, and published splits on its five benchmarks, which becomes the matched baseline Coupled Mamba is scored against; the same implementation with one encoder changed at a time; LucaOne, a single jointly pretrained nucleic-acid and protein model, as a baseline; full-transcript half-life and translation efficiency on the mRNABench splits after feasibility gates; the mRFP synonymous control early and in parallel; structure features where a task calls for them; and multi-teacher distillation as an exploratory idea to think through before the next meeting, not to implement. Section 12.8 gives each add-on and where it slots into the Gantt chart.</w:t>
+        <w:t>Coupled Mamba stays the priority architecture (Gantt IDs 20 and 21), with IsoFormer-style cross-attention second (ID 25). The research plan adds seven numbered items to that design without replacing any of it, carried out as the plan states them, in its order: (1) Priority 1, reproduce BioLangFusion exactly with its own encoders, codon grid, three heads, TextCNN head, and published splits on its five benchmarks (Phase A), which becomes the matched baseline Coupled Mamba is scored against, then change one encoder at a time (Phase B); (2) Priority 2, LucaOne, a single jointly pretrained nucleic-acid and protein model, as a baseline; (3) Priority 3, full-transcript half-life on the mRNABench splits after a feasibility gate; (4) Priority 4, translation efficiency on the mRNABench splits after its gate; (5) a low-cost control run in parallel, the mRFP synonymous variants; (6) an optional extension, structure features where a task calls for them; and (7) an exploratory direction, multi-teacher distillation with six DNA, five RNA, and four protein teachers, to think through before the next meeting, not to implement yet. Section 12.8 gives each item and where it slots into the Gantt chart.</w:t>
       </w:r>
     </w:p>
     <w:tbl>
@@ -1218,7 +1218,7 @@
                 <w:sz w:val="21"/>
                 <w:szCs w:val="21"/>
               </w:rPr>
-              <w:t>BioLangFusion reproduced exactly (its three heads under a TextCNN); the matched published system the designs are scored against</w:t>
+              <w:t>BioLangFusion reproduced exactly (its three heads under a TextCNN); the matched published system the designs are scored against (research plan item 1)</w:t>
             </w:r>
           </w:p>
         </w:tc>
@@ -1278,7 +1278,7 @@
                 <w:sz w:val="21"/>
                 <w:szCs w:val="21"/>
               </w:rPr>
-              <w:t>LucaOne, one jointly pretrained nucleic-acid and protein model, frozen</w:t>
+              <w:t>LucaOne, one jointly pretrained nucleic-acid and protein model, frozen (research plan item 2)</w:t>
             </w:r>
           </w:p>
         </w:tc>
@@ -2461,7 +2461,7 @@
           <w:b/>
           <w:bCs/>
         </w:rPr>
-        <w:t>Coupled Mamba (priority 1):</w:t>
+        <w:t>Coupled Mamba (architecture priority 1):</w:t>
       </w:r>
       <w:r>
         <w:t xml:space="preserve"> linear cost, and no alignment loss needed by design, though all streams must share a step grid (the codon grid here).</w:t>
@@ -2481,7 +2481,7 @@
           <w:b/>
           <w:bCs/>
         </w:rPr>
-        <w:t xml:space="preserve">Cross-attention, </w:t>
+        <w:t>Cross-attention, Isoformer-style (architecture priority 2)</w:t>
       </w:r>
       <w:proofErr w:type="spellStart"/>
       <w:r>
@@ -2489,7 +2489,6 @@
           <w:b/>
           <w:bCs/>
         </w:rPr>
-        <w:t>Isoformer</w:t>
       </w:r>
       <w:proofErr w:type="spellEnd"/>
       <w:r>
@@ -2497,7 +2496,7 @@
           <w:b/>
           <w:bCs/>
         </w:rPr>
-        <w:t>-style (priority 2):</w:t>
+        <w:t>:</w:t>
       </w:r>
       <w:r>
         <w:t xml:space="preserve"> the most validated option in the literature, with quadratic cost.</w:t>
@@ -2514,7 +2513,7 @@
       </w:pPr>
       <w:r>
         <w:rPr/>
-        <w:t xml:space="preserve">BioLangFusion's architecture reproduced exactly (add-on baseline): codon-grid resampling, codon-aware concatenation, gated MIL attention with an entropy regularizer, cross-modal multi-head attention, and a fixed TextCNN head, with its three encoders and published splits on its five benchmarks; then the same implementation with one encoder changed at a time. It is the matched published baseline Coupled Mamba is scored against on identical samples and splits.</w:t>
+        <w:t>BioLangFusion's architecture reproduced exactly (research plan item 1): codon-grid resampling, codon-aware concatenation, gated MIL attention with an entropy regularizer, cross-modal multi-head attention, and a fixed TextCNN head, with its three encoders and published splits on its five benchmarks; then the same implementation with one encoder changed at a time. It is the matched published baseline Coupled Mamba is scored against on identical samples and splits.</w:t>
       </w:r>
     </w:p>
     <w:p>
@@ -2542,7 +2541,7 @@
       </w:pPr>
       <w:r>
         <w:rPr/>
-        <w:t xml:space="preserve">LucaOne (add-on baseline): one jointly pretrained model for nucleic acid and protein, frozen, under the same folds and head, as the comparison for fusion of separately pretrained encoders.</w:t>
+        <w:t>LucaOne (research plan item 2): one jointly pretrained model for nucleic acid and protein, frozen, under the same folds and head, as the comparison for fusion of separately pretrained encoders.</w:t>
       </w:r>
     </w:p>
     <w:p>
@@ -6795,7 +6794,7 @@
       </w:r>
       <w:r>
         <w:rPr/>
-        <w:t xml:space="preserve">ten mature-mRNA datasets, 59 subtasks, 45 nucleotide models placed; homology-aware splits, with evidence that random splits overestimate generalization. Enters as the half-life and translation-efficiency tasks with their splits (add-on 4) and as grouped evaluation in the common rules.</w:t>
+        <w:t>ten mature-mRNA datasets, 59 subtasks, 45 nucleotide models placed; homology-aware splits, with evidence that random splits overestimate generalization. Enters as the half-life and translation-efficiency tasks with their splits (research plan items 3 and 4) and as grouped evaluation in the common rules.</w:t>
       </w:r>
     </w:p>
     <w:p>
@@ -6875,7 +6874,7 @@
       </w:r>
       <w:r>
         <w:rPr/>
-        <w:t xml:space="preserve">one encoder and one vocabulary for nucleic acid and protein. Enters as the jointly pretrained baseline (add-on 3).</w:t>
+        <w:t>one encoder and one vocabulary for nucleic acid and protein. Enters as the jointly pretrained baseline (research plan item 2).</w:t>
       </w:r>
     </w:p>
     <w:p>
@@ -6895,7 +6894,7 @@
       </w:r>
       <w:r>
         <w:rPr/>
-        <w:t xml:space="preserve">contrastive alignment of a protein language model's residue states to a structure encoder plus structure-token prediction, with large gains on fitness and contact prediction. A different sense of alignment (sequence to structure within one molecule), named in the Overleaf so it is not confused with ours; a candidate structure feature for add-on 6.</w:t>
+        <w:t>contrastive alignment of a protein language model's residue states to a structure encoder plus structure-token prediction, with large gains on fitness and contact prediction. A different sense of alignment (sequence to structure within one molecule), named in the Overleaf so it is not confused with ours; a candidate structure feature for research plan item 6, the optional structure extension.</w:t>
       </w:r>
     </w:p>
     <w:p>
@@ -6915,7 +6914,7 @@
       </w:r>
       <w:r>
         <w:rPr/>
-        <w:t xml:space="preserve">sequence-structure alignment in an RNA foundation model with bidirectional sequence-to-structure and structure-to-sequence mappings; 74% of EternaV2 design puzzles solved against at most 3% for other foundation models. The same sense of alignment on the RNA side; a candidate RNA encoder and structure source for add-on 6.</w:t>
+        <w:t>sequence-structure alignment in an RNA foundation model with bidirectional sequence-to-structure and structure-to-sequence mappings; 74% of EternaV2 design puzzles solved against at most 3% for other foundation models. The same sense of alignment on the RNA side; a candidate RNA encoder and structure source for research plan item 6, the optional structure extension.</w:t>
       </w:r>
     </w:p>
     <w:p>
@@ -28529,7 +28528,7 @@
       </w:pPr>
       <w:r>
         <w:rPr/>
-        <w:t xml:space="preserve">For the exploratory distillation idea (Section 12.9): which encoders count as the DNA, RNA, and protein teachers, and whether the similarity structure a student is asked to reproduce should be the raw one or the one left after the composition control, since for the DNA encoders most of the raw structure is composition.</w:t>
+        <w:t>For the exploratory distillation idea (Section 12.10): which two DNA encoders and which RNA encoder join the twelve Stage 1 encoders to make the research plan's six DNA, five RNA, and four protein teachers. The plan's objective matches the raw similarity structure and is run as written; since for the DNA encoders most of the raw structure is composition, the structure left after the composition control is reported beside it.</w:t>
       </w:r>
     </w:p>
     <w:p>
@@ -28723,7 +28722,7 @@
       </w:r>
       <w:r>
         <w:rPr/>
-        <w:t xml:space="preserve">The same codon grid, fusion heads, prediction head, and splits, with one encoder swapped at a time (Section 12.8, add-ons 1 and 2). If the swaps Stage 1 marks as complementary (a codon-level RNA encoder with a protein encoder) gain and the swaps it marks as redundant do not, the Stage 1 measurements predict fusion benefit and the definition earns its keep as a method.</w:t>
+        <w:t>The same codon grid, fusion heads, prediction head, and splits, with one encoder swapped at a time (Section 12.8, research plan item 1). If the swaps Stage 1 marks as complementary (a codon-level RNA encoder with a protein encoder) gain and the swaps it marks as redundant do not, the Stage 1 measurements predict fusion benefit and the definition earns its keep as a method.</w:t>
       </w:r>
     </w:p>
     <w:p>
@@ -28747,7 +28746,7 @@
       </w:r>
       <w:r>
         <w:rPr/>
-        <w:t xml:space="preserve">On mRFP every sequence encodes one protein, so the protein encoders are invariant by construction and only nucleotide-level information can predict expression (Section 12.8, add-on 5). The same test runs on any coding-sequence task by randomizing synonymous codons, as CaLM's authors did.</w:t>
+        <w:t>On mRFP every sequence encodes one protein, so the protein encoders are invariant by construction and only nucleotide-level information can predict expression (Section 12.8, research plan item 5). The same test runs on any coding-sequence task by randomizing synonymous codons, as CaLM's authors did.</w:t>
       </w:r>
     </w:p>
     <w:p>
@@ -28851,7 +28850,7 @@
       <w:proofErr w:type="spellEnd"/>
       <w:r>
         <w:rPr/>
-        <w:t xml:space="preserve">Stage 3 designs the neural architectures that combine pretrained biological foundation models. Stage 1 established that simple linear concatenation of frozen pooled vectors captures early synergy (e.g., codon-level RNA plus protein), but falls short of trained multi-modal models like BioLangFusion and IsoFormer. Stage 2 decided to impose positional alignment only through the codon grid, where the inputs share one coding sequence, and to train the first fusion models without an explicit representation-alignment loss, which could suppress information only one modality carries; that loss is tested as an ablation in Stage 4 (Section 12.5). Stage 3 translates these conclusions into concrete, trainable fusion modules operating over token-level representations: Coupled Mamba first, IsoFormer-style cross-attention second, each against a mandatory reference baseline. The research plan adds two baselines to that design without changing it: a faithful reproduction of BioLangFusion's own architecture, which becomes the matched baseline the Stage 3 designs are scored against, and LucaOne, a jointly pretrained model (Section 11.4). The Overleaf figures "The three fusion designs of Stage 3" and "The add-on baseline and what it is compared with" show both.</w:t>
+        <w:t>Stage 3 designs the neural architectures that combine pretrained biological foundation models. Stage 1 established that simple linear concatenation of frozen pooled vectors captures early synergy (e.g., codon-level RNA plus protein), but falls short of trained multi-modal models like BioLangFusion and IsoFormer. Stage 2 decided to impose positional alignment only through the codon grid, where the inputs share one coding sequence, and to train the first fusion models without an explicit representation-alignment loss, which could suppress information only one modality carries; that loss is tested as an ablation in Stage 4 (Section 12.5). Stage 3 translates these conclusions into concrete, trainable fusion modules operating over token-level representations: Coupled Mamba first, IsoFormer-style cross-attention second, each against a mandatory reference baseline. The research plan's first two items add two baselines to that design without changing it: a faithful reproduction of BioLangFusion's own architecture (item 1), which becomes the matched baseline the Stage 3 designs are scored against, and LucaOne, a jointly pretrained model (item 2; Section 11.4). The Overleaf figures "The three fusion designs of Stage 3" and "The research plan's baseline and what it is compared with" show both.</w:t>
       </w:r>
     </w:p>
     <w:p>
@@ -28943,7 +28942,7 @@
         <w:spacing w:before="200" w:after="80"/>
       </w:pPr>
       <w:r>
-        <w:t>11.2 Priority 1: Coupled Mamba (Recurrent State-Space Fusion)</w:t>
+        <w:t>11.2 Architecture Priority 1: Coupled Mamba (Recurrent State-Space Fusion)</w:t>
       </w:r>
     </w:p>
     <w:p>
@@ -29139,7 +29138,7 @@
       </w:r>
       <w:r>
         <w:rPr/>
-        <w:t xml:space="preserve">the reproduced BioLangFusion heads (Section 11.4) are its matched baseline. Coupled Mamba replaces the fusion head in the reproduced pipeline (same grid, head, splits, and evaluation), first with BioLangFusion's encoders and then with the best encoders from the swap add-on, so that its gain over the three reproduced heads is measured on identical samples and splits. The feasibility tests (Gantt 20) run in parallel with the reproduction (Gantt 17), so neither waits on the other.</w:t>
+        <w:t>the reproduced BioLangFusion heads (Section 11.4) are its matched baseline. Coupled Mamba replaces the fusion head in the reproduced pipeline (same grid, head, splits, and evaluation), first with BioLangFusion's encoders and then with the best encoders from the Phase B swaps of research plan item 1, so that its gain over the three reproduced heads is measured on identical samples and splits. The feasibility tests (Gantt 20) run in parallel with the reproduction (Gantt 17), so neither waits on the other.</w:t>
       </w:r>
     </w:p>
     <w:p>
@@ -29148,7 +29147,7 @@
         <w:spacing w:before="200" w:after="80"/>
       </w:pPr>
       <w:r>
-        <w:t xml:space="preserve">11.3 Priority 2: </w:t>
+        <w:t xml:space="preserve">11.3 Architecture Priority 2: </w:t>
       </w:r>
       <w:proofErr w:type="spellStart"/>
       <w:r>
@@ -29338,7 +29337,7 @@
         <w:rPr>
           <w:b/>
         </w:rPr>
-        <w:t xml:space="preserve">• BioLangFusion's architecture, reproduced exactly (add-on baseline): </w:t>
+        <w:t xml:space="preserve">• BioLangFusion's architecture, reproduced exactly (research plan item 1): </w:t>
       </w:r>
       <w:r>
         <w:rPr/>
@@ -29370,7 +29369,7 @@
         <w:rPr>
           <w:b/>
         </w:rPr>
-        <w:t xml:space="preserve">• LucaOne (add-on baseline): </w:t>
+        <w:t xml:space="preserve">• LucaOne (research plan item 2): </w:t>
       </w:r>
       <w:r>
         <w:rPr/>
@@ -29479,7 +29478,7 @@
       <w:proofErr w:type="spellEnd"/>
       <w:r>
         <w:rPr/>
-        <w:t xml:space="preserve">Stage 4 is the empirical testing campaign. It answers the central scientific question: When does combining pretrained DNA, RNA, and protein models beat the best single-modality model, and can Stage 1 representation diagnostics predict that gain in advance? The experimental design is structured to eliminate data leakage, enforce strict controls, and systematically test pre-registered hypotheses. The research plan sharpens the objective and adds to it: the campaign tests whether foundation models pretrained on different data, tokenizations, and objectives learn complementary biological representations, and whether fusing them improves downstream prediction over strong single-encoder baselines, with two guard rails on every result. Different representations do not by themselves prove that two encoders hold independent biological information, so no such claim is made from similarity measurements; and a fusion gain is an incremental predictive benefit under a stated protocol (Δfusion, Section 12.4), not a proof of independent information either. Representational overlap is measured and reported separately; it is not an assumed prerequisite for fusion, and it is not forced as a training objective. The tiers, the tests, and the ablations below are the Stage 4 design; Section 12.8 lists what the research plan adds and where each add-on slots into the tiers and the Gantt chart.</w:t>
+        <w:t>Stage 4 is the empirical testing campaign. It answers the central scientific question: When does combining pretrained DNA, RNA, and protein models beat the best single-modality model, and can Stage 1 representation diagnostics predict that gain in advance? The experimental design is structured to eliminate data leakage, enforce strict controls, and systematically test pre-registered hypotheses. The research plan sharpens the objective and adds to it: the campaign tests whether foundation models pretrained on different data, tokenizations, and objectives learn complementary biological representations, and whether fusing them improves downstream prediction over strong single-encoder baselines, with two guard rails on every result. Different representations do not by themselves prove that two encoders hold independent biological information, so no such claim is made from similarity measurements; and a fusion gain is an incremental predictive benefit under a stated protocol (Δfusion, Section 12.4), not a proof of independent information either. Representational overlap is measured and reported separately; it is not an assumed prerequisite for fusion, and it is not forced as a training objective. The tiers, the tests, and the ablations below are the Stage 4 design; Section 12.8 lists the research plan's seven items, under its own numbers, and where each slots into the tiers and the Gantt chart.</w:t>
       </w:r>
     </w:p>
     <w:p>
@@ -29520,7 +29519,7 @@
       </w:r>
       <w:r>
         <w:rPr/>
-        <w:t xml:space="preserve">Under a fixed architecture, encoder swaps that Stage 1 marks as complementary and non-compositional (a codon-level RNA encoder with a protein encoder) gain more than swaps it marks as redundant or compositional. This is the method test of Section 12.6, and add-on 2 is its cleanest form.</w:t>
+        <w:t>Under a fixed architecture, encoder swaps that Stage 1 marks as complementary and non-compositional (a codon-level RNA encoder with a protein encoder) gain more than swaps it marks as redundant or compositional. This is the method test of Section 12.6, and Phase B of research plan item 1 is its cleanest form.</w:t>
       </w:r>
     </w:p>
     <w:p>
@@ -29631,7 +29630,7 @@
       </w:r>
       <w:r>
         <w:rPr/>
-        <w:t xml:space="preserve">Precompute token and pooled embeddings for core models; build deduplicated, sequence-disjoint splits and Ensembl genomic coordinate caches (Gantt 16). Add-on: the five BioLangFusion benchmark files with their published split artifacts, and the LucaOne checkpoint with its input-limit check.</w:t>
+        <w:t>Precompute token and pooled embeddings for core models; build deduplicated, sequence-disjoint splits and Ensembl genomic coordinate caches (Gantt 16). Plan items 1 and 2: the five BioLangFusion benchmark files with their published split artifacts, and the LucaOne checkpoint with its input-limit check.</w:t>
       </w:r>
     </w:p>
     <w:p>
@@ -29647,7 +29646,7 @@
       </w:r>
       <w:r>
         <w:rPr/>
-        <w:t xml:space="preserve">Fast combination screening across the 48 cross-modal pairs, 64 three-modality triples, and 18 same-modality pairs of the twelve Stage 1 encoders using pooled representations and lightweight fusion heads to test whether Stage 1 metrics predict gains across combinations. Add-on: the mRFP synonymous control (add-on 5), with the null and control comparisons of Gantt 18.</w:t>
+        <w:t>Fast combination screening across the 48 cross-modal pairs, 64 three-modality triples, and 18 same-modality pairs of the twelve Stage 1 encoders using pooled representations and lightweight fusion heads to test whether Stage 1 metrics predict gains across combinations. Plan item 5, run in parallel: the mRFP synonymous control, with the null and control comparisons of Gantt 18.</w:t>
       </w:r>
     </w:p>
     <w:p>
@@ -29663,7 +29662,7 @@
       </w:r>
       <w:r>
         <w:rPr/>
-        <w:t xml:space="preserve">Reproduce BioLangFusion and IsoFormer (Section 12.7; Gantt 17), the reproduction now faithful on all five published benchmarks (add-on 1); train full token-level Coupled Mamba (Gantt 20 and 21) and IsoFormer cross-attention (Gantt 25) models on selected combinations (including both high-synergy and low-synergy controls) against the reproduced heads; LucaOne beside them (add-on 3).</w:t>
+        <w:t>Reproduce BioLangFusion and IsoFormer (Section 12.7; Gantt 17), the BioLangFusion reproduction faithful on all five published benchmarks (plan item 1, Phase A); train full token-level Coupled Mamba (Gantt 20 and 21) and IsoFormer cross-attention (Gantt 25) models on selected combinations (including both high-synergy and low-synergy controls) against the reproduced heads; LucaOne beside them (plan item 2, Gantt 41).</w:t>
       </w:r>
     </w:p>
     <w:p>
@@ -29679,7 +29678,7 @@
       </w:r>
       <w:r>
         <w:rPr/>
-        <w:t xml:space="preserve">Run systematic ablations: alignment loss penalty weights (Gantt 23), modality dropping/reinitialization, codon grid necessity, LoRA adaptation, and the encoder swaps of add-on 2 (Gantt 24, now planned rather than conditional).</w:t>
+        <w:t>Run systematic ablations: alignment loss penalty weights (Gantt 23), modality dropping/reinitialization, codon grid necessity, LoRA adaptation, and the encoder swaps of plan item 1, Phase B (Gantt 24, now planned rather than conditional).</w:t>
       </w:r>
     </w:p>
     <w:p>
@@ -29695,7 +29694,7 @@
       </w:r>
       <w:r>
         <w:rPr/>
-        <w:t xml:space="preserve">Evaluate generalization on external benchmarks (mRNABench half-life and translation efficiency with the gates of add-on 4, protein-to-mRNA ratio, the CaLM suite, mRNABench) and compare against published BioLangFusion and IsoFormer numbers (Gantt 29 and 38).</w:t>
+        <w:t>Evaluate generalization on external benchmarks (mRNABench half-life and translation efficiency after the gates of plan items 3 and 4, Gantt 42; the protein-to-mRNA ratio, the CaLM suite, the rest of mRNABench) and compare against published BioLangFusion and IsoFormer numbers (Gantt 29 and 38). The optional structure extension (plan item 6, Gantt 38) and the distillation idea (plan item 7, Gantt 43) come after the core comparisons.</w:t>
       </w:r>
     </w:p>
     <w:p>
@@ -29941,7 +29940,7 @@
                 <w:sz w:val="20"/>
                 <w:szCs w:val="20"/>
               </w:rPr>
-              <w:t>Same coding sequence to every encoder (add-ons 1 and 5)</w:t>
+              <w:t>Same coding sequence to every encoder (research plan items 1 and 5)</w:t>
             </w:r>
           </w:p>
         </w:tc>
@@ -30925,7 +30924,7 @@
                 <w:sz w:val="20"/>
                 <w:szCs w:val="20"/>
               </w:rPr>
-              <w:t>Physically distinct molecules (add-ons 3 and 4)</w:t>
+              <w:t>Physically distinct molecules and full transcripts (research plan items 2, 3, and 4)</w:t>
             </w:r>
           </w:p>
         </w:tc>
@@ -33313,7 +33312,7 @@
       </w:r>
       <w:r>
         <w:rPr/>
-        <w:t xml:space="preserve">mRNA stability (CodonBERT; in hand), mRFP synonymous variants of one gene in E. coli (CodonBERT; in hand; protein identical, so only codon-level information can carry signal; the research plan's add-on 5 runs it early and in parallel), fungal expression across many genomes (CodonBERT, 7,056 CDS, 3,138 used by BioLangFusion; cross-species codon bias, where the composition baseline is decisive), and E. coli expression (6,348 CDS, 4,450 used; codon with protein in one organism). Added by the research plan for the BioLangFusion reproduction (add-on 1): Ab1 (723 antibody-encoding mRNAs, protein expression; designed coding sequences where the first codons and codon usage act) and CoV-Vac (2,400 designed fragments of up to 81 nt, degradation; the shortest sequences in the set, where structure dominates and the RNA encoder leads every single-encoder result).</w:t>
+        <w:t>mRNA stability (CodonBERT; in hand), mRFP synonymous variants of one gene in E. coli (CodonBERT; in hand; protein identical, so only codon-level information can carry signal; research plan item 5, the low-cost control run in parallel), fungal expression across many genomes (CodonBERT, 7,056 CDS, 3,138 used by BioLangFusion; cross-species codon bias, where the composition baseline is decisive), and E. coli expression (6,348 CDS, 4,450 used; codon with protein in one organism). Added by the research plan for the BioLangFusion reproduction (research plan item 1): Ab1 (723 antibody-encoding mRNAs, protein expression; designed coding sequences where the first codons and codon usage act) and CoV-Vac (2,400 designed fragments of up to 81 nt, degradation; the shortest sequences in the set, where structure dominates and the RNA encoder leads every single-encoder result).</w:t>
       </w:r>
     </w:p>
     <w:p>
@@ -33329,7 +33328,7 @@
       </w:r>
       <w:r>
         <w:rPr/>
-        <w:t xml:space="preserve">GTEx isoform expression (IsoFormer; pilot in hand, full table about 160,000 training transcripts; whether a different molecule adds signal a shared input cannot, with the four length features matching all twelve encoders on the pilot; also the second LucaOne dataset of add-on 3, with the window truncated to its 1,280-token limit); mRNA half-life (Saluki: 13,921 human and 14,463 mouse genes, spliced mRNA with codon and exon-junction tracks, Pearson 0.77; codon effects near start and stop, 3' UTR motifs, and splice sites all matter); translation efficiency (RiboNN: 10,348 human genes over 78 cell types, r² 0.62; 5' UTR about 22%, CDS about 73%, 3' UTR about 5%; first ten codons weigh about twice the rest); and the protein-to-mRNA ratio (Eraslan; 11,575 genes, 29 tissues; codons alone 17%, amino-acid frequencies 15%).</w:t>
+        <w:t>GTEx isoform expression (IsoFormer; pilot in hand, full table about 160,000 training transcripts; whether a different molecule adds signal a shared input cannot, with the four length features matching all twelve encoders on the pilot; also the second LucaOne dataset of research plan item 2, with the window truncated to its 1,280-token limit); mRNA half-life (Saluki: 13,921 human and 14,463 mouse genes, spliced mRNA with codon and exon-junction tracks, Pearson 0.77; codon effects near start and stop, 3' UTR motifs, and splice sites all matter); translation efficiency (RiboNN: 10,348 human genes over 78 cell types, r² 0.62; 5' UTR about 22%, CDS about 73%, 3' UTR about 5%; first ten codons weigh about twice the rest); and the protein-to-mRNA ratio (Eraslan; 11,575 genes, 29 tissues; codons alone 17%, amino-acid frequencies 15%).</w:t>
       </w:r>
     </w:p>
     <w:p>
@@ -33341,7 +33340,7 @@
         <w:rPr>
           <w:b/>
         </w:rPr>
-        <w:t xml:space="preserve">• Full transcripts on the mRNABench splits (add-on 4), labels kept distinct: </w:t>
+        <w:t xml:space="preserve">• Full transcripts on the mRNABench splits (research plan items 3 and 4), labels kept distinct: </w:t>
       </w:r>
       <w:r>
         <w:rPr/>
@@ -33596,7 +33595,7 @@
       <w:proofErr w:type="spellEnd"/>
       <w:r>
         <w:rPr/>
-        <w:t xml:space="preserve">• 8. Encoder swaps under a fixed architecture (add-ons 1 and 2): the five BioLangFusion benchmarks; does a codon-level RNA encoder, a larger or differently trained protein encoder, or a different DNA encoder improve the reproduced system, and do the gains follow Stage 1's complementarity measurements (H2)?</w:t>
+        <w:t>• 8. Encoder swaps under a fixed architecture (research plan item 1): Fungal, E. coli, mRNA stability, and Ab1, with CoV-Vac if feasible; does a codon-level RNA encoder, a larger or differently trained protein encoder, or a different DNA encoder improve the reproduced system, and do the gains follow Stage 1's complementarity measurements (H2)?</w:t>
       </w:r>
     </w:p>
     <w:p>
@@ -33614,7 +33613,7 @@
       <w:proofErr w:type="spellEnd"/>
       <w:r>
         <w:rPr/>
-        <w:t xml:space="preserve">• 9. One model against fusion (add-on 3): stability and GTEx; LucaOne's frozen embeddings against the best single encoder and the best fused model under one head (H6).</w:t>
+        <w:t>• 9. One model against fusion (research plan item 2): stability and GTEx; LucaOne's frozen embeddings against the best single encoder and the best fused model under one head (H6).</w:t>
       </w:r>
     </w:p>
     <w:p>
@@ -33632,7 +33631,7 @@
       <w:proofErr w:type="spellEnd"/>
       <w:r>
         <w:rPr/>
-        <w:t xml:space="preserve">• 10. Transcript context with labels kept apart (add-on 4): half-life and translation efficiency on the mRNABench splits; coding sequence only against plus 3' UTR against the full transcript, and whether a protein encoder adds to the coding region, with half-life, translation efficiency, and ribosome load never relabeled as each other.</w:t>
+        <w:t>• 10. Transcript context with labels kept apart (research plan items 3 and 4): half-life and translation efficiency on the mRNABench splits; coding sequence only against plus 3' UTR against the full transcript, and whether a protein encoder adds to the coding region, with half-life, translation efficiency, and ribosome load never relabeled as each other.</w:t>
       </w:r>
     </w:p>
     <w:p>
@@ -33655,7 +33654,7 @@
       <w:proofErr w:type="spellEnd"/>
       <w:r>
         <w:rPr/>
-        <w:t xml:space="preserve">Order of work: the three sets in hand first (stability, mRFP, the GTEx pilot), then the fungal and E. coli files from the CodonBERT repository together with Ab1 and CoV-Vac, since all five are needed for the BioLangFusion reproduction (add-on 1); then the two large transcript-level sets with codon tracks, half-life and translation efficiency, on the mRNABench splits once they pass the gates (add-on 4); then the protein-to-mRNA ratio and the CaLM suite; then the rest of mRNABench, which supplies splits and a leaderboard; and the two single-region sets as nucleotide-only controls. Every task reports the baseline hierarchy below and the Stage 1 alignment measurements of each fused pair.</w:t>
+        <w:t>Order of work: the three sets in hand first (stability, mRFP, the GTEx pilot), then the fungal and E. coli files from the CodonBERT repository together with Ab1 and CoV-Vac, since all five are needed for the BioLangFusion reproduction (research plan item 1); then the two large transcript-level sets with codon tracks, half-life and translation efficiency, on the mRNABench splits once they pass the gates (research plan items 3 and 4); then the protein-to-mRNA ratio and the CaLM suite; then the rest of mRNABench, which supplies splits and a leaderboard; and the two single-region sets as nucleotide-only controls. Every task reports the baseline hierarchy below and the Stage 1 alignment measurements of each fused pair.</w:t>
       </w:r>
     </w:p>
     <w:p>
@@ -33780,7 +33779,7 @@
       </w:r>
       <w:r>
         <w:rPr/>
-        <w:t xml:space="preserve">The reproduced BioLangFusion and IsoFormer systems (Section 12.7), LucaOne (Section 12.8, add-on 3), and the published scores themselves (BioLangFusion's five benchmarks; IsoFormer's R² 0.43 on GTEx).</w:t>
+        <w:t>The reproduced BioLangFusion and IsoFormer systems (Section 12.7), LucaOne (Section 12.8, research plan item 2), and the published scores themselves (BioLangFusion's five benchmarks; IsoFormer's R² 0.43 on GTEx).</w:t>
       </w:r>
     </w:p>
     <w:p>
@@ -33805,7 +33804,7 @@
       </w:r>
       <w:r>
         <w:rPr/>
-        <w:t xml:space="preserve">Train all 7 non-empty subsets of DNA, RNA, and protein; calculate Shapley values per modality; and test zero-out modality dropping at inference time to confirm the model does not collapse onto a single dominant encoder. The gated-attention head's modality weights give the same reading for free. The ablations are the Gantt chart's conditional items (IDs 22 to 24) plus the modality and counterfactual tests; each runs inside the reproduced pipeline, so that it changes exactly one thing.</w:t>
+        <w:t>Train all 7 non-empty subsets of DNA, RNA, and protein; calculate Shapley values per modality; and test zero-out modality dropping at inference time to confirm the model does not collapse onto a single dominant encoder. The gated-attention head's modality weights give the same reading for free. The ablations are the Gantt chart's ablation items (IDs 22 to 24) plus the modality and counterfactual tests; each runs inside the reproduced pipeline, so that it changes exactly one thing.</w:t>
       </w:r>
     </w:p>
     <w:p>
@@ -34017,7 +34016,7 @@
       <w:proofErr w:type="spellEnd"/>
       <w:r>
         <w:rPr/>
-        <w:t xml:space="preserve">LucaOne, the research plan's add-on, learns one representation for nucleic acid and protein jointly (one 1.8-billion-parameter transformer, a shared 39-token vocabulary, inputs embedded separately, a 1,280-token limit) and imposes no token correspondence at all; its question is whether joint pretraining already provides what fusing separately pretrained encoders provides. It has no reported numbers on these tasks; its own benchmarks compare it with DNABERT-2 and ESM-2 3B.</w:t>
+        <w:t>LucaOne, the research plan's second item, learns one representation for nucleic acid and protein jointly (one 1.8-billion-parameter transformer, a shared 39-token vocabulary, inputs embedded separately, a 1,280-token limit) and imposes no token correspondence at all; its question is whether joint pretraining already provides what fusing separately pretrained encoders provides. It has no reported numbers on these tasks; its own benchmarks compare it with DNABERT-2 and ESM-2 3B.</w:t>
       </w:r>
     </w:p>
     <w:p>
@@ -34033,7 +34032,7 @@
       </w:r>
       <w:r>
         <w:rPr/>
-        <w:t xml:space="preserve">BioLangFusion in two settings: exactly as published, on its five benchmarks with the published splits, recipe, and metrics (add-on 1, Section 12.8), and then on the Stage 1 embeddings and sequence-grouped split with the 295 unseen test sequences reported separately, so that the differences from the published numbers (data version, split, training-set size) are each varied on their own; IsoFormer's cross-attention aggregator with frozen encoders on the GTEx pilot, then on the full table, with the length baseline beside it; LucaOne's frozen embeddings on the same folds and head after the input-limit check (add-on 3).</w:t>
+        <w:t>BioLangFusion in two settings: exactly as published, on its five benchmarks with the published splits, recipe, and metrics (research plan item 1, Section 12.8), and then on the Stage 1 embeddings and sequence-grouped split with the 295 unseen test sequences reported separately, so that the differences from the published numbers (data version, split, training-set size) are each varied on their own; IsoFormer's cross-attention aggregator with frozen encoders on the GTEx pilot, then on the full table, with the length baseline beside it; LucaOne's frozen embeddings on the same folds and head after the input-limit check (research plan item 2).</w:t>
       </w:r>
     </w:p>
     <w:p>
@@ -34049,7 +34048,7 @@
       </w:r>
       <w:r>
         <w:rPr/>
-        <w:t xml:space="preserve">swap encoders only, one at a time (add-on 2: CaLM or mRNA-FM for RNA-FM; ESM-2 150M or ProtBERT for ESM-2 8M; other DNA encoders); remove the grid and fuse unaligned token streams; add an alignment loss at the codon level; replace the head with Coupled Mamba. Questions: does positional alignment matter; does representational alignment help on a shared input; do the Stage 1 complementarity measures predict which encoder swap gains?</w:t>
+        <w:t>swap encoders only, one at a time (research plan item 1, Phase B: CaLM or mRNA-FM for RNA-FM; ESM-2 150M or ProtBERT for ESM-2 8M; other DNA encoders); remove the grid and fuse unaligned token streams; add an alignment loss at the codon level; replace the head with Coupled Mamba. Questions: does positional alignment matter; does representational alignment help on a shared input; do the Stage 1 complementarity measures predict which encoder swap gains?</w:t>
       </w:r>
     </w:p>
     <w:p>
@@ -34105,8 +34104,7 @@
       </w:pPr>
       <w:r>
         <w:rPr/>
-        <w:lastRenderedPageBreak/>
-        <w:t xml:space="preserve">12.8 What the Research Plan Adds, and Where Each Add-On Slots In</w:t>
+        <w:t>12.8 What the Research Plan Adds, and Where Each Item Slots In</w:t>
       </w:r>
     </w:p>
     <w:p>
@@ -34129,7 +34127,7 @@
       <w:proofErr w:type="spellEnd"/>
       <w:r>
         <w:rPr/>
-        <w:t xml:space="preserve">The research plan adds seven items to this design. None replaces a planned item: Coupled Mamba stays the priority architecture, the tiers and the ablations stand, and the task set keeps its order. Each add-on sharpens the design in one way: the reproduction gives Coupled Mamba a matched published baseline on identical splits; the encoder swaps are the cleanest test of H2; LucaOne tests whether joint pretraining already does what fusion does; the full-transcript tasks and their label gates make tests 3 and 4 precise; and the distillation idea is one Stage 1 already has something to say about. Gantt IDs are as of October 3 and subject to change.</w:t>
+        <w:t>The research plan adds seven numbered items to this design, and the project carries them out as the plan states them, in its order and under its numbers, on top of the work already done: (1) Priority 1, reproduce BioLangFusion exactly (Phase A), then change the encoders only (Phase B); (2) Priority 2, LucaOne; (3) Priority 3, full-transcript half-life; (4) Priority 4, translation efficiency; (5) a low-cost control run in parallel, mRFP synonymous expression; (6) an optional extension, structure representations; (7) an exploratory direction, multi-teacher distillation, to think through before the meeting and not implement yet. None replaces a planned item: Coupled Mamba stays the priority architecture, the tiers and the ablations stand, and the task set keeps its order. Each item sharpens the design in one way: the reproduction gives Coupled Mamba a matched published baseline on identical splits, and its encoder swaps are the cleanest test of H2; LucaOne tests whether joint pretraining already does what fusion does; the half-life and translation-efficiency tasks and their label gates make tests 3 and 4 precise; the mRFP control holds the protein constant; structure enters only where it plausibly acts; and the distillation idea is one Stage 1 already has something to say about. Gantt IDs are as of October 15 and subject to change.</w:t>
       </w:r>
     </w:p>
     <w:p>
@@ -34141,11 +34139,11 @@
         <w:rPr>
           <w:b/>
         </w:rPr>
-        <w:t xml:space="preserve">• Add-on 1, reproduce BioLangFusion exactly (Phase A): </w:t>
+        <w:t xml:space="preserve">• Item 1 (Priority 1), Phase A, reproduce BioLangFusion exactly: </w:t>
       </w:r>
       <w:r>
         <w:rPr/>
-        <w:t xml:space="preserve">implement the input preparation and codon resampling, the three original encoders, all three fusion heads, and the TextCNN head (Section 11.4), with the published splits, training recipe, hyperparameters, metrics, and preprocessing followed as closely as possible, and every unavailable detail recorded as an explicit deviation. Run every benchmark the paper reports, with the published values to match: Fungal (Wint 2022; expression; Spearman; 7,056 raw, 3,138 used): NT 0.804, RNA-FM 0.767, ESM-2 8M 0.695, best fused 0.824 (MIL). E. coli (Ding 2022; low, medium, high expression; accuracy; 6,348 raw, 4,450 used): 41.29, 52.95, 49.02; best fused 53.93 (cross-attention). mRNA stability (Diez 2022; Spearman; 65,356 raw, 23,929 used): 0.530, 0.553, 0.539; best fused 0.563 (MIL). Ab1 (Yazdani 2024; protein expression of antibody-encoding mRNA; Spearman; 723 sequences up to 1,203 nt): 0.732, 0.743, 0.711; best fused 0.765 (cross-attention). CoV-Vac (Leppek 2022; degradation of 2,400 designed fragments up to 81 nt; Spearman): 0.780, 0.841, 0.806; best fused 0.864 (MIL). Concatenation scores 0.805, 50.28, 0.539, 0.764, and 0.831 in the same order; the paper reports no variance. Confirm the exact dataset releases and split artifacts before training. Slots into Tier 2: it widens Gantt 17 (October 12 to 18) from matched comparisons on the project's data to the published benchmarks, and it is the matched baseline for Coupled Mamba (Gantt 21).</w:t>
+        <w:t>implement the input preparation and codon resampling, the three original encoders, all three fusion heads, and the TextCNN head (Section 11.4), with the published splits, training recipe, hyperparameters, metrics, and preprocessing followed as closely as possible, and every unavailable detail recorded as an explicit deviation. Run every benchmark the paper reports, with the published values to match: Fungal (Wint 2022; expression; Spearman; 7,056 raw, 3,138 used): NT 0.804, RNA-FM 0.767, ESM-2 8M 0.695, best fused 0.824 (MIL). E. coli (Ding 2022; low, medium, high expression; accuracy; 6,348 raw, 4,450 used): 41.29, 52.95, 49.02; best fused 53.93 (cross-attention). mRNA stability (Diez 2022; Spearman; 65,356 raw, 23,929 used): 0.530, 0.553, 0.539; best fused 0.563 (MIL). Ab1 (Yazdani 2024; protein expression of antibody-encoding mRNA; Spearman; 723 sequences up to 1,203 nt): 0.732, 0.743, 0.711; best fused 0.765 (cross-attention). CoV-Vac (Leppek 2022; degradation of 2,400 designed fragments up to 81 nt; Spearman): 0.780, 0.841, 0.806; best fused 0.864 (MIL). Concatenation scores 0.805, 50.28, 0.539, 0.764, and 0.831 in the same order; the paper reports no variance. Confirm the exact dataset releases and split artifacts before training. Slots into Tier 2: it widens Gantt 17 (October 12 to 25) from matched comparisons on the project's data to the published benchmarks, and it is the matched baseline for Coupled Mamba (Gantt 21).</w:t>
       </w:r>
     </w:p>
     <w:p>
@@ -34157,11 +34155,11 @@
         <w:rPr>
           <w:b/>
         </w:rPr>
-        <w:t xml:space="preserve">• Add-on 2, change the encoders only (Phase B): </w:t>
+        <w:t xml:space="preserve">• Item 1 (Priority 1), Phase B, change the encoders only: </w:t>
       </w:r>
       <w:r>
         <w:rPr/>
-        <w:t xml:space="preserve">keep the splits, preprocessing, fusion heads, TextCNN, and evaluation fixed. Replace one encoder at a time, then test the promising DNA, RNA, and protein triples. Candidates from Stage 1: CaLM and mRNA-FM (codon-level RNA), ProtBERT and ESM-2 150M (protein), and the alternative DNA encoders (NT 500M human-ref, DNABERT-2, HyenaDNA); an encoder is used only where its input coverage and token-to-codon handling are valid, and any adapter is documented and held fixed. Report for every dataset: the published score; the reproduced original-encoder score; the best single encoder under the same head; each original fusion head; each encoder-swap fusion score; and Δfusion over the best corresponding single encoder, as mean ± spread across seeds with paired differences on identical samples and splits, with each fused pair's Stage 1 alignment measurements beside it. Success criterion: at least one swap improves reproducible test performance under the unchanged architecture; a negative result is still informative, and no improvement is attributed to a tokenizer or corpus on its own without a separate controlled ablation. Phase A fixes positional alignment; Phase B changes only the encoders, so the pattern of gains across swaps is a direct test of H2. Slots into Tier 3: Gantt 24 (November 9 to 15) becomes planned rather than conditional, and can move earlier if Phase A finishes on time.</w:t>
+        <w:t>keep the splits, preprocessing, fusion heads, TextCNN, and evaluation fixed. Replace one encoder at a time, then test the promising DNA, RNA, and protein triples, on Fungal, E. coli, mRNA stability, and Ab1, and on CoV-Vac if feasible, as the plan's implementation order specifies. Candidates from Stage 1, as the plan lists them: CaLM or other suitable codon models and mRNA-FM (codon-level RNA), ProtBERT (protein), and the alternative DNA encoders (NT 500M human-ref, DNABERT-2, HyenaDNA), with ESM-2 150M as a further protein candidate; an encoder is used only where its input coverage and token-to-codon handling are valid, and any adapter is documented and held fixed. Report for every dataset: the published score; the reproduced original-encoder score; the best single encoder under the same head; each original fusion head; each encoder-swap fusion score; and Δfusion over the best corresponding single encoder, as mean ± spread across seeds with paired differences on identical samples and splits, with each fused pair's Stage 1 alignment measurements beside it. Success criterion: at least one swap improves reproducible test performance under the unchanged architecture; a negative result is still informative, and no improvement is attributed to a tokenizer or corpus on its own without a separate controlled ablation. Phase A fixes positional alignment; Phase B changes only the encoders, so the pattern of gains across swaps is a direct test of H2. Slots into Tier 3: Gantt 24 (October 26 to November 8), directly after Phase A and before LucaOne, as the plan's implementation order sets it; planned rather than conditional.</w:t>
       </w:r>
     </w:p>
     <w:p>
@@ -34173,11 +34171,11 @@
         <w:rPr>
           <w:b/>
         </w:rPr>
-        <w:t xml:space="preserve">• Add-on 3, LucaOne: </w:t>
+        <w:t xml:space="preserve">• Item 2 (Priority 2), LucaOne: </w:t>
       </w:r>
       <w:r>
         <w:rPr/>
-        <w:t xml:space="preserve">extract LucaOne embeddings on the compatible stability and GTEx examples, after verifying its input limits and supported sequence types against each dataset. Use the same train and test folds and the same prediction head, or a clearly matched probe setting, as the fusion models. Compare LucaOne alone with the best single encoder and the best fused model; report computational cost and input truncation; and distinguish separately embedded inputs, which is what LucaOne does, from joint inference over a nucleic-acid and protein pair, which it does not perform. A result in either direction is a statement about the tested frozen configurations, not about joint modeling in general. Slots into Tier 2, a new row beside Gantt 16 and 17.</w:t>
+        <w:t>extract LucaOne embeddings on the compatible stability and GTEx examples, after verifying its input limits and supported sequence types against each dataset. Use the same train and test folds and the same prediction head, or a clearly matched probe setting, as the fusion models. Compare LucaOne alone with the best single encoder and the best fused model; report computational cost and input truncation; and distinguish separately embedded inputs, which is what LucaOne does, from joint inference over a nucleic-acid and protein pair, which it does not perform. A result in either direction is a statement about the tested frozen configurations, not about joint modeling in general. Slots into Tier 2, Gantt 41 (November 9 to 22), a new row after the encoder swaps, as the plan's implementation order sets it.</w:t>
       </w:r>
     </w:p>
     <w:p>
@@ -34189,11 +34187,11 @@
         <w:rPr>
           <w:b/>
         </w:rPr>
-        <w:t xml:space="preserve">• Add-on 4, half-life and translation efficiency on the mRNABench splits: </w:t>
+        <w:t xml:space="preserve">• Item 3 (Priority 3), full-transcript half-life on the mRNABench splits: </w:t>
       </w:r>
       <w:r>
         <w:rPr/>
-        <w:t xml:space="preserve">half-life (rnahl-saluki-human, rnahl-saluki-mouse; LBKWK half-life): the stability benchmark covers coding sequence only, omitting the regulatory regions that contribute to mRNA stability; after the gates, compare coding sequence only, coding sequence plus 3' UTR, and the full transcript, each encoded by the nucleotide encoders, with protein-derived representations added for the same coding region; matched samples and folds; best unimodal, fusion, and simple length and composition baselines. Translation efficiency (translation-efficiency-human, -mouse; MRL Sugimoto; LBKWK MRL): initiation and elongation depend on different sequence features, so it tests whether RNA-, codon-, and protein-derived representations are complementary; compare 5' UTR, coding sequence, full transcript, full transcript plus protein, and the three-encoder fusion, with RiboNN as the external benchmark where task-compatible; coding-sequence-derived streams aligned on the codon grid where possible, untranslated regions handled separately, and the gain reported over the best full-transcript baseline. MIMIC (Golkar et al., 2026) motivates these benchmarks but does not show that fusion of separately pretrained encoders will improve them. No claim of separate molecular measurements from sequence-derived inputs. Slots into Tier 4: Gantt 38 (January to February), or earlier if the gates pass and cluster time allows.</w:t>
+        <w:t>RNA half-life, Saluki human and mouse (rnahl-saluki-human, rnahl-saluki-mouse), and the LBKWK half-life target (mrl-hl-lbkwk); neither is MRL Sugimoto, which measures mean ribosome load, and each runs separately on its own published split and metric. The stability benchmark covers coding sequence only, omitting the regulatory regions that may contribute to mRNA stability. Gate first: 5' and 3' UTRs and coding-sequence coordinates present, with labels, species, and non-leaking grouped splits; if transcript regions are absent the task is not treated as a full-transcript test. Then compare coding sequence only, coding sequence plus 3' UTR, and the full transcript, each encoded by the nucleotide encoders, with protein-derived representations added for the same coding region; matched samples and folds; best unimodal, fusion, and simple length and composition baselines. Conclusion: the incremental predictive value of transcript regions and of fusion; no claim of separate molecular measurements from sequence-derived inputs. Slots into Tier 4: Gantt 42 (January 4 to February 28, conditional), or earlier if the gate passes and cluster time allows.</w:t>
       </w:r>
     </w:p>
     <w:p>
@@ -34205,7 +34203,23 @@
         <w:rPr>
           <w:b/>
         </w:rPr>
-        <w:t xml:space="preserve">• Add-on 5, the mRFP control in parallel: </w:t>
+        <w:t xml:space="preserve">• Item 4 (Priority 4), translation efficiency on the mRNABench splits: </w:t>
+      </w:r>
+      <w:r>
+        <w:rPr/>
+        <w:t>translation efficiency, human and mouse (translation-efficiency-human, translation-efficiency-mouse), is TE and is not relabeled as ribosome load; MRL Sugimoto and the LBKWK MRL target are mean ribosome load, not half-life; each target runs separately under its original evaluation protocol. Initiation and elongation depend on different sequence features, so the task tests whether RNA-, codon-, and protein-derived representations are complementary. Gate first: the measured target confirmed (TE or mean ribosome load), full transcript, UTR, and coding-sequence coordinates available, the experimental context and grouped splits valid, and TE not conflated with protein abundance. Then compare the 5' UTR, coding sequence, full transcript, full transcript plus protein, and the three-encoder fusion, with RiboNN as the external benchmark where task-compatible; coding-sequence-derived streams aligned on the codon grid where possible, untranslated regions handled separately, and the gain reported over the best full-transcript baseline. MIMIC (Golkar et al., 2026) motivates these benchmarks but does not show that fusion of separately pretrained encoders will improve them. Slots into Tier 4: Gantt 42 with item 3.</w:t>
+      </w:r>
+    </w:p>
+    <w:p>
+      <w:pPr>
+        <w:pStyle w:val="ListParagraph"/>
+        <w:spacing w:after="80"/>
+      </w:pPr>
+      <w:r>
+        <w:rPr>
+          <w:b/>
+        </w:rPr>
+        <w:t xml:space="preserve">• Item 5 (low-cost control, in parallel), mRFP synonymous expression: </w:t>
       </w:r>
       <w:r>
         <w:rPr/>
@@ -34234,8 +34248,7 @@
       </w:pPr>
       <w:r>
         <w:rPr/>
-        <w:lastRenderedPageBreak/>
-        <w:t xml:space="preserve">12.9 Add-On 6, Optional: RNA and Protein Structure Representations</w:t>
+        <w:t>12.9 Item 6, Optional Extension: RNA and Protein Structure Representations</w:t>
       </w:r>
     </w:p>
     <w:p>
@@ -34267,8 +34280,7 @@
       </w:pPr>
       <w:r>
         <w:rPr/>
-        <w:lastRenderedPageBreak/>
-        <w:t xml:space="preserve">12.10 Add-On 7, Exploratory: Multi-Teacher, Modality-Specific Distillation (To Think About Before the Meeting)</w:t>
+        <w:t>12.10 Item 7, Exploratory Direction: Multi-Teacher, Modality-Specific Distillation (To Think About Before the Meeting)</w:t>
       </w:r>
     </w:p>
     <w:p>
@@ -34291,7 +34303,7 @@
       <w:proofErr w:type="spellEnd"/>
       <w:r>
         <w:rPr/>
-        <w:t xml:space="preserve">A hypothesis to examine before the next review, not an experiment to run now, and it does not alter the faithful reproduction.</w:t>
+        <w:t>A hypothesis to examine before the next review, not an experiment to run now; it is optional, follows the core BioLangFusion reproduction and encoder-swap experiments, and does not alter the faithful reproduction.</w:t>
       </w:r>
     </w:p>
     <w:p>
@@ -34307,7 +34319,7 @@
       </w:r>
       <w:r>
         <w:rPr/>
-        <w:t xml:space="preserve">distill the pretrained encoders of each modality (six DNA, five RNA, and four protein teachers) into three compact students, one per modality, and then fuse the three student representations. Different teacher corpora, tokenizers, and objectives may expose complementary features; distillation may preserve that diversity at lower inference cost.</w:t>
+        <w:t>distill the pretrained encoders of each modality (six DNA, five RNA, and four protein teachers) into three compact students, one per modality, and then fuse the three student representations. Different teacher corpora, tokenizers, and objectives may expose complementary features; distillation may preserve that diversity at lower inference cost. The plan sets six DNA, five RNA, and four protein teachers; Stage 1 has four encoders per modality, so the teacher set is the twelve Stage 1 encoders plus two further DNA encoders and one further RNA encoder, chosen with the advisor before any run. Stage 1 itself is unchanged; the added encoders enter only as teachers.</w:t>
       </w:r>
     </w:p>
     <w:p>
@@ -34323,7 +34335,7 @@
       </w:r>
       <w:r>
         <w:rPr/>
-        <w:t xml:space="preserve">the teachers stay frozen and give sequence-level embeddings of possibly different widths. One trainable student per modality produces an embedding z (dimension d_s, say 256), and a separate trainable linear projection per teacher maps it to d_p = 128. For a batch of B sequences, each teacher yields a B × B cosine-similarity matrix between examples, and each projection of the student yields one too. The loss is the mean squared difference between the student's and the teacher's off-diagonal similarities, averaged over the teachers with equal weights (1/K_m) until the uniform baseline has been evaluated. Only the student and its projections are updated. This is relational knowledge distillation (Park et al., 2019) with one projection per teacher, which replaces direct feature matching (FitNets); the teacher-specific formulation is the project's own design.</w:t>
+        <w:t>the teachers stay frozen and give sequence-level embeddings of possibly different widths. One trainable student per modality produces an embedding z (dimension d_s; 256 to start, tunable), and a separate trainable linear projection per teacher maps it to d_p = 128. For a batch of B sequences, each teacher yields a B × B cosine-similarity matrix between examples, and each projection of the student yields one too. The loss is the mean squared difference between the student's and the teacher's off-diagonal similarities, averaged over the teachers with equal weights (1/K_m) until the uniform baseline has been evaluated. Only the student and its projections are updated. This is relational knowledge distillation (Park et al., 2019) with one projection per teacher, which replaces direct feature matching (FitNets); the teacher-specific formulation is the research plan's own design, not a verbatim objective from either paper.</w:t>
       </w:r>
     </w:p>
     <w:p>
@@ -34335,11 +34347,11 @@
         <w:rPr>
           <w:b/>
         </w:rPr>
-        <w:t xml:space="preserve">• Fusion and evaluation: </w:t>
+        <w:t xml:space="preserve">• Training, fusion, and evaluation: </w:t>
       </w:r>
       <w:r>
         <w:rPr/>
-        <w:t xml:space="preserve">after distillation the three students are frozen, their embeddings concatenated, and only a supervised fusion head is trained with the task loss (MSE or cross-entropy); the projections are discarded for this first test only after checking that the unprojected student embeddings retain downstream utility. Two held-out quantities, neither a training loss: Δstudent = Perf(fused students) minus the best single student, and Δteacher = Perf(fused students) minus Perf(fused full-size teachers), together with parameter count, memory, and inference cost. A positive Δstudent shows benefit over the best student alone; Δteacher measures what the compression cost, since a low relational loss does not establish that the students retained all task-relevant information.</w:t>
+        <w:t>each student is trained on a large unlabeled pool for its modality that excludes the protected test sequences and their close homologs, with teacher embeddings cached where storage allows and diverse mini-batches (B = 64 to start); per-teacher relational loss, student variance, held-out similarity agreement, and cost are tracked, and capacity and batch sampling are tuned on training and validation data only. The students are then frozen, their embeddings concatenated, and only a supervised fusion head is trained with the task loss (MSE or cross-entropy); the projections are discarded for this first test only after checking that the unprojected student embeddings retain downstream utility, and both choices are compared. Joint task fine-tuning with L_total = L_task + λ Σ L_distill (λ chosen on validation data) is an optional comparison. Two held-out quantities, neither a training loss: Δstudent = Perf(fused students) minus the best single student, and Δteacher = Perf(fused students) minus Perf(fused full-size teachers), together with parameter count, memory, and inference cost. A positive Δstudent shows benefit over the best student alone; Δteacher measures what the compression cost, since a low relational loss does not establish that the students retained all task-relevant information. The objective is also compared with single-teacher distillation, equal-capacity alternatives, and larger and smaller students, to report the accuracy and compression trade-off.</w:t>
       </w:r>
     </w:p>
     <w:p>
@@ -34355,7 +34367,7 @@
       </w:r>
       <w:r>
         <w:rPr/>
-        <w:t xml:space="preserve">matched teacher and student inputs per modality; no train-test or homolog leakage in the unlabeled distillation pool; identical splits and capacity controls; monitoring for collapse (student variance, per-teacher similarity, nontrivial downstream scores); and the same downstream head and splits for each student, the three-student concatenation, the strongest single teachers, within-modality teacher ensembles, and full three-modality teacher fusion.</w:t>
+        <w:t>matched teacher and student inputs per modality; no train-test or homolog leakage in the unlabeled distillation pool; identical splits and capacity controls; the relational target checked across batches and with length-controlled comparisons, since it depends on pooling, sequence length, and batch composition; monitoring for collapse (student variance, per-teacher similarity, nontrivial downstream scores), with an anti-collapse term only if validation diagnoses collapse; and the same downstream head and splits for each student, the three-student concatenation, the strongest single teachers, within-modality teacher ensembles, and full three-modality teacher fusion.</w:t>
       </w:r>
     </w:p>
     <w:p>
@@ -34371,7 +34383,7 @@
       </w:r>
       <w:r>
         <w:rPr/>
-        <w:t xml:space="preserve">the relational loss asks a student to reproduce each teacher's sequence-to-sequence similarity structure, which is exactly what Track B measured between teachers (RSA, linear CKA). Three findings bear on it. First, for the DNA encoders most of that structure is composition (CKA falls 52% to 90% after the composition control for every pair with a DNA encoder), so a DNA student distilled from the raw similarities would largely learn to reproduce counts; the review should decide whether to distill the raw structure or the structure left after the control. Second, some teachers are near-redundant (RNA-FM with RiNALMo at CKA 0.809; the ESM-2 family), so five RNA teachers and four protein teachers carry fewer distinct similarity structures than that, and uniform teacher weights count redundant teachers twice. Third, the sequence-level loss does not preserve local codon, UTR, or residue detail, and Track A found that the codon-level encoders' contribution lives exactly there (GC3 at R² 0.896 to 0.986 for nucleotide encoders against 0.379 to 0.440 for protein encoders), so a region- or token-level term would be needed before the students could be expected to keep it. The natural evaluation is on the five BioLangFusion benchmarks with the reproduced heads, so that Δstudent and Δteacher are comparable with the Phase B results and with Coupled Mamba. Not scheduled; a candidate for Gantt 38 after the review.</w:t>
+        <w:t>the relational loss asks a student to reproduce each teacher's sequence-to-sequence similarity structure, which is exactly what Track B measured between teachers (RSA, linear CKA). Three findings bear on it, and each is handled inside the plan rather than by changing it. First, for the DNA encoders most of that structure is composition (CKA falls 52% to 90% after the composition control for every pair with a DNA encoder), so a DNA student distilled from the raw similarities would largely learn to reproduce counts; the plan's raw objective is run as written, and the same student trained on the similarity left after the control is reported beside it as a diagnostic. Second, some teachers are near-redundant (RNA-FM with RiNALMo at CKA 0.809; the ESM-2 family), so equal weights count redundant teachers more than once; the uniform baseline the plan requires before any learned weights shows how much that matters. Third, the sequence-level loss does not preserve local codon, UTR, or residue detail, and Track A found that the codon-level encoders' contribution lives there (GC3 at R² 0.896 to 0.986 for nucleotide encoders against 0.379 to 0.440 for protein encoders); the plan adds a token- or region-level term only where biologically justified and separately validated, and Stage 1 marks the coding sequence as the place to justify one.</w:t>
       </w:r>
     </w:p>
     <w:p>
@@ -34387,7 +34399,7 @@
       </w:r>
       <w:r>
         <w:rPr/>
-        <w:t xml:space="preserve">which encoders are the teachers (the plan counts six DNA, five RNA, and four protein; Stage 1 has four of each); raw or composition-controlled similarity as the target; sequence-level only, or a token-level term for the coding sequence; and whether the students should be evaluated on the five BioLangFusion benchmarks first.</w:t>
+        <w:t>which two DNA encoders and which RNA encoder join the twelve Stage 1 encoders to make the plan's six DNA, five RNA, and four protein teachers; and whether the five BioLangFusion benchmarks with the reproduced heads are the evaluation set. The objective is the plan's, run as written.</w:t>
       </w:r>
     </w:p>
     <w:p>
@@ -34399,11 +34411,11 @@
         <w:rPr>
           <w:b/>
         </w:rPr>
-        <w:t xml:space="preserve">• Proposed answer to Mina's question (does it make sense, how to proceed): </w:t>
+        <w:t xml:space="preserve">• How it proceeds, following the plan: </w:t>
       </w:r>
       <w:r>
         <w:rPr/>
-        <w:t xml:space="preserve">it makes sense as a Stage 4 follow-up rather than a core item: a compression and ensembling experiment that asks whether the diversity of the teachers survives in a small student, with the same held-out gains as everything else. How to proceed, following from Stage 1: (1) pilot one modality first, RNA, where there are four teachers in hand and one known redundant pair; (2) distill the composition-controlled similarity structure, or at least report both targets, since the raw structure of the DNA teachers is mostly counts; (3) keep the teacher-specific projections until the unprojected student has been shown to retain downstream utility; (4) evaluate on the five BioLangFusion benchmarks with the reproduced heads so that Δstudent sits beside the Phase B numbers; (5) decide on the three-student fusion only after the single-modality pilot shows that a student keeps what its teachers carry.</w:t>
+        <w:t>it is a Stage 4 follow-up after the core BioLangFusion reproduction and encoder swaps, a compression and ensembling experiment that asks whether the diversity of the teachers survives in a small student, scored with the same held-out gains as everything else. Following the plan's implementation checklist: (1) settle the teacher set, the twelve Stage 1 encoders plus two DNA encoders and one RNA encoder; (2) pin teacher checkpoints, sequence normalization, tokenizer versions, truncation, and pooling, and check that sample IDs refer to the same sequences across a modality's teachers; (3) build the leakage-free unlabeled pools and cache the teacher embeddings; (4) train each student with the plan's objective, starting with RNA as in the plan's worked example, then DNA and protein, with the composition-controlled target reported beside the raw one; (5) evaluate each student, then train the fusion head and report Δstudent and Δteacher with cost, on the five BioLangFusion benchmarks with the reproduced heads so that the results sit beside the Phase B numbers and Coupled Mamba. Gantt 43 (January 4 to February 28), conditional, after the core comparisons.</w:t>
       </w:r>
     </w:p>
     <w:p>
@@ -34436,7 +34448,7 @@
       <w:proofErr w:type="spellEnd"/>
       <w:r>
         <w:rPr/>
-        <w:t xml:space="preserve">The next meeting with Mina Basirat is October 20, 2026. She is reviewing the Overleaf manuscript herself, so the meeting is for the important findings and the experimental design, with her research plan's items shown as add-ons to it (Sections 11 and 12). The deck is a Claude Slides deck with speaker notes on each slide; its .pptx export belongs at docs/notes/Mina_Meeting_Slides_2026-10-20.pptx.</w:t>
+        <w:t>The next meeting with Mina Basirat is October 20, 2026. She is reviewing the Overleaf manuscript herself, so the meeting is for the important findings and the experimental design, with her research plan's seven items carried out as written, in its order and under its numbers, on top of it (Sections 11 and 12). The deck is a Claude Slides deck with speaker notes on each slide; its .pptx export belongs at docs/notes/Slides/Mina_Meeting_Slides_2026-10-20.pptx.</w:t>
       </w:r>
     </w:p>
     <w:p>
@@ -34548,7 +34560,7 @@
       <w:proofErr w:type="spellEnd"/>
       <w:r>
         <w:rPr/>
-        <w:t xml:space="preserve">• Experimental design: the Stage 2 decision and the fusion gain Δfusion; the three Stage 3 designs, Coupled Mamba first; the research plan's add-ons and where each slots into the tiers and the Gantt chart: BioLangFusion reproduced exactly on its five benchmarks with the published values to match, then one encoder changed at a time; LucaOne; the mRNABench half-life and translation-efficiency tasks with their gates and label distinctions; the mRFP control; the baseline hierarchy; the task-coverage matrix; and what Stage 1 says about the distillation idea.</w:t>
+        <w:t>• Experimental design: the Stage 2 decision and the fusion gain Δfusion; the three Stage 3 designs, Coupled Mamba first; the research plan's seven items in its order and where each slots into the tiers and the Gantt chart: (1) BioLangFusion reproduced exactly on its five benchmarks with the published values to match, then one encoder changed at a time; (2) LucaOne; (3) half-life and (4) translation efficiency on the mRNABench splits with their gates and label distinctions; (5) the mRFP control; (6) structure; the baseline hierarchy; the task-coverage matrix; and (7) what Stage 1 says about the distillation idea.</w:t>
       </w:r>
     </w:p>
     <w:p>
@@ -34625,7 +34637,7 @@
       <w:proofErr w:type="spellEnd"/>
       <w:r>
         <w:rPr/>
-        <w:t xml:space="preserve">• 3. Where the add-ons sit in the Gantt chart: the proposal is to widen ID 17 (October 12 to 18) to the faithful reproduction on all five published datasets, make ID 24 (encoder swaps, November 9 to 15) planned rather than conditional, add a LucaOne row beside 16 and 17, and put the mRNABench tasks in ID 38 unless cluster time allows earlier. Does that order work, and should the swaps move ahead of the alignment-objective ablation (ID 23)?</w:t>
+        <w:t>• 3. Where the seven items sit in the Gantt chart, in her implementation order: ID 17 widened (October 12 to 25) to the faithful reproduction on all five published datasets; the encoder swaps directly after it, ID 24 (October 26 to November 8), planned rather than conditional; then LucaOne, ID 41 (November 9 to 22); the mRFP control in parallel in ID 18; the half-life and translation-efficiency tasks in ID 42 and distillation in ID 43 (January to February, conditional); structure in ID 38. Does that order and timing work?</w:t>
       </w:r>
     </w:p>
     <w:p>
@@ -34697,7 +34709,7 @@
       <w:proofErr w:type="spellEnd"/>
       <w:r>
         <w:rPr/>
-        <w:t xml:space="preserve">• 7. Distillation: our proposed answer is that it makes sense as a Stage 4 follow-up, piloted on RNA with a composition-controlled similarity target and evaluated on the five BioLangFusion benchmarks with the reproduced heads (Section 12.10). Does that match what she has in mind, and which encoders count as the six DNA, five RNA, and four protein teachers?</w:t>
+        <w:t>• 7. Distillation: we carry it out as the plan states it, after the core comparisons (Section 12.10): her relational objective with equal teacher weights, RNA first as in her worked example, the composition-controlled target reported beside the raw one, and evaluation on the five BioLangFusion benchmarks with the reproduced heads. Which two DNA encoders and which RNA encoder should join the twelve Stage 1 encoders to make the six DNA, five RNA, and four protein teachers?</w:t>
       </w:r>
     </w:p>
     <w:p>

</xml_diff>

<commit_message>
Put Mina's research plan first: baselines and datasets before Coupled Mamba and cross-attention; resync Gantt, notes, deck, figures and READMEs
</commit_message>
<xml_diff>
--- a/docs/notes/Mina_Project_Notes.docx
+++ b/docs/notes/Mina_Project_Notes.docx
@@ -267,7 +267,7 @@
       </w:r>
       <w:r>
         <w:rPr/>
-        <w:t>Concatenation + MLP is the floor; Coupled Mamba on the codon grid is architecture priority 1 (interaction through the recurrence, nothing forces similarity); IsoFormer-style cross-attention is architecture priority 2 (learns correspondence where there is no grid). The research plan's first two items add the matched baselines: BioLangFusion reproduced exactly (item 1; its attention head is also the simple fusion baseline of Fusion or Confusion) and LucaOne (item 2; joint pretraining instead of fusion). Every design is scored against the reproduced heads on identical splits.</w:t>
+        <w:t>The research plan comes first: its baselines are built before any of the project's designs, namely BioLangFusion reproduced exactly with its encoders then swapped (item 1; its attention head is also the simple fusion baseline of Fusion or Confusion), LucaOne (item 2; joint pretraining instead of fusion), and IsoFormer's aggregator on GTEx; concatenation + MLP is the floor. Then the project's designs: Coupled Mamba on the codon grid first (interaction through the recurrence, nothing forces similarity), IsoFormer-style cross-attention second (learns correspondence where there is no grid). Every design is scored against all of those baselines on identical splits.</w:t>
       </w:r>
     </w:p>
     <w:p>
@@ -287,7 +287,7 @@
       </w:r>
       <w:r>
         <w:rPr/>
-        <w:t>The research plan's seven items run in its order, on top of the design: (1) BioLangFusion reproduced exactly, then encoder swaps; (2) LucaOne; (3) full-transcript half-life; (4) translation efficiency; (5) the mRFP control; (6) structure, optional; (7) distillation, exploratory. Around them: baselines and controls; Coupled Mamba against the reproduced heads; ablations (alignment loss, grid); the task set, chosen so each dataset isolates one question; and the method test, whether Stage 1 metrics predict Δfusion. The question "this RNA model with this DNA model for this task" is answered by encoder swaps under a fixed architecture across that task set; COMET adds multi-molecule tasks with published combinations and LucaOne as reference points, and mRNABench adds homology-aware splits. Fusion or Confusion's checklist (identical heads, tuned baselines, grouped cross-validation, mean ± SD, a statistical comparison) is the evaluation rule on every comparison. The Overleaf figure "The chain of stages" shows this on one page.</w:t>
+        <w:t>The research plan comes first, in its order: (1) BioLangFusion reproduced exactly, then encoder swaps; (2) LucaOne; (3) full-transcript half-life; (4) translation efficiency; (5) the mRFP control. Then Coupled Mamba and cross-attention against all of those baselines on the plan's datasets; ablations (alignment loss, grid); and last the plan's (6) structure, optional, and (7) distillation, exploratory. Throughout: the task set, chosen so each dataset isolates one question; and the method test, whether Stage 1 metrics predict Δfusion. The question "this RNA model with this DNA model for this task" is answered by encoder swaps under a fixed architecture across that task set; COMET adds multi-molecule tasks with published combinations and LucaOne as reference points, and mRNABench adds homology-aware splits. Fusion or Confusion's checklist (identical heads, tuned baselines, grouped cross-validation, mean ± SD, a statistical comparison) is the evaluation rule on every comparison. The Overleaf figure "The chain of stages" shows this on one page.</w:t>
       </w:r>
     </w:p>
     <w:p>
@@ -479,7 +479,7 @@
       </w:r>
       <w:r>
         <w:rPr/>
-        <w:t>First actions: token-level embeddings for the twelve encoders; the BioLangFusion reproduction (Gantt 17); Coupled Mamba feasibility tests (20); cross-attention (25); the LucaOne input check (41).</w:t>
+        <w:t>The research plan first: the BioLangFusion reproduction with token-level embeddings (Gantt 17), the encoder swaps (24), LucaOne (41), and IsoFormer on GTEx (44); Coupled Mamba (20, 21) and cross-attention (25) follow, from January.</w:t>
       </w:r>
     </w:p>
     <w:p>
@@ -499,7 +499,7 @@
       </w:r>
       <w:r>
         <w:rPr/>
-        <w:t>The research plan's seven items in its order, on top of the design: baselines with the mRFP control in parallel (16, 18), the BioLangFusion reproduction (17), the encoder swaps (24), LucaOne (41), alongside Coupled Mamba against the reproduced heads (20, 21) and the alignment-loss ablation (23); synthesis (29); then, conditional, half-life and translation efficiency (42), structure (38), and distillation (43).</w:t>
+        <w:t>The research plan first, in its order: baselines with the mRFP control in parallel (16, 18), the BioLangFusion reproduction (17), the encoder swaps (24), LucaOne (41) and IsoFormer (44), half-life and translation efficiency (42, November 23 to December 20); synthesis for the course (29); then the project's designs, Coupled Mamba (20, 21) and cross-attention (25), with the alignment-loss ablation (23), January and February; structure (38) and distillation (43) in March, conditional.</w:t>
       </w:r>
     </w:p>
     <w:p>
@@ -745,7 +745,7 @@
       <w:proofErr w:type="spellEnd"/>
       <w:r>
         <w:rPr/>
-        <w:t>Coupled Mamba stays the priority architecture (Gantt IDs 20 and 21), with IsoFormer-style cross-attention second (ID 25). The research plan adds seven numbered items to that design without replacing any of it, carried out as the plan states them, in its order: (1) Priority 1, reproduce BioLangFusion exactly with its own encoders, codon grid, three heads, TextCNN head, and published splits on its five benchmarks (Phase A), which becomes the matched baseline Coupled Mamba is scored against, then change one encoder at a time (Phase B); (2) Priority 2, LucaOne, a single jointly pretrained nucleic-acid and protein model, as a baseline; (3) Priority 3, full-transcript half-life on the mRNABench splits after a feasibility gate; (4) Priority 4, translation efficiency on the mRNABench splits after its gate; (5) a low-cost control run in parallel, the mRFP synonymous variants; (6) an optional extension, structure features where a task calls for them; and (7) an exploratory direction, multi-teacher distillation with six DNA, five RNA, and four protein teachers, to think through before the next meeting, not to implement yet. Section 12.8 gives each item and where it slots into the Gantt chart.</w:t>
+        <w:t>Coupled Mamba stays the project's first design (Gantt IDs 20 and 21), with IsoFormer-style cross-attention second (ID 25), and both come after the research plan's items: every baseline and dataset the plan names is in place first (October to December), and the designs are trained from January and scored against all of them. The research plan adds seven numbered items, carried out as the plan states them, in its order: (1) Priority 1, reproduce BioLangFusion exactly with its own encoders, codon grid, three heads, TextCNN head, and published splits on its five benchmarks (Phase A), which becomes the matched baseline Coupled Mamba is scored against, then change one encoder at a time (Phase B); (2) Priority 2, LucaOne, a single jointly pretrained nucleic-acid and protein model, as a baseline; (3) Priority 3, full-transcript half-life on the mRNABench splits after a feasibility gate; (4) Priority 4, translation efficiency on the mRNABench splits after its gate; (5) a low-cost control run in parallel, the mRFP synonymous variants; (6) an optional extension, structure features where a task calls for them; and (7) an exploratory direction, multi-teacher distillation with six DNA, five RNA, and four protein teachers, to think through before the next meeting, not to implement yet. IsoFormer's own aggregator is reproduced on GTEx beside LucaOne as a further baseline (Gantt 44), though it is not on the plan's list. Section 12.8 gives each item and where it slots into the Gantt chart.</w:t>
       </w:r>
     </w:p>
     <w:tbl>
@@ -867,7 +867,7 @@
                 <w:sz w:val="21"/>
                 <w:szCs w:val="21"/>
               </w:rPr>
-              <w:t>1</w:t>
+              <w:t>1, after the baselines</w:t>
             </w:r>
           </w:p>
         </w:tc>
@@ -1192,7 +1192,7 @@
                 <w:sz w:val="21"/>
                 <w:szCs w:val="21"/>
               </w:rPr>
-              <w:t>Added baseline</w:t>
+              <w:t>Baseline, built first</w:t>
             </w:r>
           </w:p>
         </w:tc>
@@ -1252,7 +1252,7 @@
                 <w:sz w:val="21"/>
                 <w:szCs w:val="21"/>
               </w:rPr>
-              <w:t>Added baseline</w:t>
+              <w:t>Baseline, built first</w:t>
             </w:r>
           </w:p>
         </w:tc>
@@ -1279,6 +1279,66 @@
                 <w:szCs w:val="21"/>
               </w:rPr>
               <w:t>LucaOne, one jointly pretrained nucleic-acid and protein model, frozen (research plan item 2)</w:t>
+            </w:r>
+          </w:p>
+        </w:tc>
+      </w:tr>
+      <w:tr>
+        <w:tblPrEx>
+          <w:tblCellMar>
+            <w:top w:w="0" w:type="dxa"/>
+            <w:bottom w:w="0" w:type="dxa"/>
+          </w:tblCellMar>
+        </w:tblPrEx>
+        <w:tc>
+          <w:tcPr>
+            <w:tcW w:w="2200" w:type="dxa"/>
+            <w:tcBorders>
+              <w:top w:val="single" w:sz="4" w:space="0" w:color="808080"/>
+              <w:left w:val="single" w:sz="4" w:space="0" w:color="808080"/>
+              <w:bottom w:val="single" w:sz="4" w:space="0" w:color="808080"/>
+              <w:right w:val="single" w:sz="4" w:space="0" w:color="808080"/>
+            </w:tcBorders>
+            <w:tcMar>
+              <w:top w:w="60" w:type="dxa"/>
+              <w:left w:w="100" w:type="dxa"/>
+              <w:bottom w:w="60" w:type="dxa"/>
+              <w:right w:w="100" w:type="dxa"/>
+            </w:tcMar>
+          </w:tcPr>
+          <w:p>
+            <w:r>
+              <w:rPr>
+                <w:sz w:val="21"/>
+                <w:szCs w:val="21"/>
+              </w:rPr>
+              <w:t>Baseline, built first</w:t>
+            </w:r>
+          </w:p>
+        </w:tc>
+        <w:tc>
+          <w:tcPr>
+            <w:tcW w:w="7160" w:type="dxa"/>
+            <w:tcBorders>
+              <w:top w:val="single" w:sz="4" w:space="0" w:color="808080"/>
+              <w:left w:val="single" w:sz="4" w:space="0" w:color="808080"/>
+              <w:bottom w:val="single" w:sz="4" w:space="0" w:color="808080"/>
+              <w:right w:val="single" w:sz="4" w:space="0" w:color="808080"/>
+            </w:tcBorders>
+            <w:tcMar>
+              <w:top w:w="60" w:type="dxa"/>
+              <w:left w:w="100" w:type="dxa"/>
+              <w:bottom w:w="60" w:type="dxa"/>
+              <w:right w:w="100" w:type="dxa"/>
+            </w:tcMar>
+          </w:tcPr>
+          <w:p>
+            <w:r>
+              <w:rPr>
+                <w:sz w:val="21"/>
+                <w:szCs w:val="21"/>
+              </w:rPr>
+              <w:t>IsoFormer's aggregator reproduced on GTEx, beside LucaOne (not on the plan's list)</w:t>
             </w:r>
           </w:p>
         </w:tc>
@@ -2461,10 +2521,10 @@
           <w:b/>
           <w:bCs/>
         </w:rPr>
-        <w:t>Coupled Mamba (architecture priority 1):</w:t>
-      </w:r>
-      <w:r>
-        <w:t xml:space="preserve"> linear cost, and no alignment loss needed by design, though all streams must share a step grid (the codon grid here).</w:t>
+        <w:t>Coupled Mamba (design 1, after the research plan's baselines): linear cost,</w:t>
+      </w:r>
+      <w:r>
+        <w:t xml:space="preserve"> and no alignment loss needed by design, though all streams must share a step grid (the codon grid here).</w:t>
       </w:r>
     </w:p>
     <w:p>
@@ -2481,7 +2541,7 @@
           <w:b/>
           <w:bCs/>
         </w:rPr>
-        <w:t>Cross-attention, Isoformer-style (architecture priority 2)</w:t>
+        <w:t>Cross-attention, Isoformer-style (design 2): the most validated option</w:t>
       </w:r>
       <w:proofErr w:type="spellStart"/>
       <w:r>
@@ -2496,10 +2556,9 @@
           <w:b/>
           <w:bCs/>
         </w:rPr>
-        <w:t>:</w:t>
-      </w:r>
-      <w:r>
-        <w:t xml:space="preserve"> the most validated option in the literature, with quadratic cost.</w:t>
+      </w:r>
+      <w:r>
+        <w:t xml:space="preserve"> in the literature, with quadratic cost.</w:t>
       </w:r>
     </w:p>
     <w:p>
@@ -2649,7 +2708,7 @@
       <w:proofErr w:type="spellEnd"/>
       <w:r>
         <w:rPr/>
-        <w:t xml:space="preserve">Coupled Mamba and cross-attention are both built and benchmarked, with Coupled Mamba first. The reproduced BioLangFusion heads and LucaOne are the baselines they are scored against, on identical samples and splits. The remaining options are fallbacks if either underperforms, not additional models to build from the start.</w:t>
+        <w:t>Coupled Mamba and cross-attention are both built and benchmarked, with Coupled Mamba first, once the research plan's baselines exist. The reproduced BioLangFusion heads, the encoder swaps, LucaOne, and IsoFormer's aggregator are the baselines they are scored against, on identical samples and splits. The remaining options are fallbacks if either underperforms, not additional models to build from the start.</w:t>
       </w:r>
     </w:p>
     <w:p>
@@ -28290,7 +28349,7 @@
       </w:r>
       <w:r>
         <w:rPr/>
-        <w:t xml:space="preserve">On coding-sequence tasks, DNA, RNA, and protein token streams are resampled to one codon grid, exactly as BioLangFusion does, and the same grid is the step index Coupled Mamba needs; that step is part of reproducing the system and is a token-location operation, not a claim about shared information. Outside the coding sequence there is no global grid: the untranslated regions have no protein counterpart, and a genomic window, a transcript, and a protein do not share one coordinate. There, fusion is pooled or region-aware (Section 11.4): coding-sequence-derived streams can still be aligned on the grid, and the untranslated regions are handled separately.</w:t>
+        <w:t>On coding-sequence tasks, DNA, RNA, and protein token streams are resampled to one codon grid, exactly as BioLangFusion does, and the same grid is the step index Coupled Mamba needs; that step is part of reproducing the system and is a token-location operation, not a claim about shared information. Outside the coding sequence there is no global grid: the untranslated regions have no protein counterpart, and a genomic window, a transcript, and a protein do not share one coordinate. There, fusion is pooled or region-aware (Section 11.2): coding-sequence-derived streams can still be aligned on the grid, and the untranslated regions are handled separately.</w:t>
       </w:r>
     </w:p>
     <w:p>
@@ -28818,7 +28877,7 @@
       </w:r>
       <w:r>
         <w:rPr/>
-        <w:t xml:space="preserve">A fifth test comes with the GTEx cross-attention model (Section 11.3). On GTEx the only positional correspondence between the window and the transcript is the first exon. If the model's transcript-to-DNA attention concentrates there without being told, alignment can be discovered from the task where biology supplies it, and need not be imposed anywhere.</w:t>
+        <w:t>A fifth test comes with the GTEx cross-attention model (Section 11.4). On GTEx the only positional correspondence between the window and the transcript is the first exon. If the model's transcript-to-DNA attention concentrates there without being told, alignment can be discovered from the task where biology supplies it, and need not be imposed anywhere.</w:t>
       </w:r>
     </w:p>
     <w:p>
@@ -28850,7 +28909,7 @@
       <w:proofErr w:type="spellEnd"/>
       <w:r>
         <w:rPr/>
-        <w:t>Stage 3 designs the neural architectures that combine pretrained biological foundation models. Stage 1 established that simple linear concatenation of frozen pooled vectors captures early synergy (e.g., codon-level RNA plus protein), but falls short of trained multi-modal models like BioLangFusion and IsoFormer. Stage 2 decided to impose positional alignment only through the codon grid, where the inputs share one coding sequence, and to train the first fusion models without an explicit representation-alignment loss, which could suppress information only one modality carries; that loss is tested as an ablation in Stage 4 (Section 12.5). Stage 3 translates these conclusions into concrete, trainable fusion modules operating over token-level representations: Coupled Mamba first, IsoFormer-style cross-attention second, each against a mandatory reference baseline. The research plan's first two items add two baselines to that design without changing it: a faithful reproduction of BioLangFusion's own architecture (item 1), which becomes the matched baseline the Stage 3 designs are scored against, and LucaOne, a jointly pretrained model (item 2; Section 11.4). The Overleaf figures "The three fusion designs of Stage 3" and "The research plan's baseline and what it is compared with" show both.</w:t>
+        <w:t>Stage 3 designs the neural architectures that combine pretrained biological foundation models. Stage 1 established that simple linear concatenation of frozen pooled vectors captures early synergy (e.g., codon-level RNA plus protein), but falls short of trained multi-modal models like BioLangFusion and IsoFormer. Stage 2 decided to impose positional alignment only through the codon grid, where the inputs share one coding sequence, and to train the first fusion models without an explicit representation-alignment loss, which could suppress information only one modality carries; that loss is tested as an ablation in Stage 4 (Section 12.5). Stage 3 translates these conclusions into concrete, trainable fusion modules operating over token-level representations. The research plan comes first: its baselines are built before any of the project's designs, namely a faithful reproduction of BioLangFusion's own architecture with its encoders then swapped (item 1), LucaOne, a jointly pretrained model (item 2), and IsoFormer's aggregator on GTEx (Section 11.2). Only then are the project's designs trained and scored against all of them: Coupled Mamba first (11.3), IsoFormer-style cross-attention second (11.4). The Overleaf figures "The three fusion designs of Stage 3" and "The research plan's baseline and what it is compared with" show both.</w:t>
       </w:r>
     </w:p>
     <w:p>
@@ -28906,7 +28965,7 @@
       </w:r>
       <w:r>
         <w:rPr/>
-        <w:t xml:space="preserve">On GTEx the 6,000 bp genomic window, the full transcript (with 5' and 3' UTRs), and the translated protein have no 1:1 token correspondence, and on the full-transcript tasks the untranslated regions have no protein counterpart. Token streams keep their native lengths; the coding-sequence-derived parts can be placed on the grid, and the rest is pooled, by region where regions are annotated (Section 11.4).</w:t>
+        <w:t>On GTEx the 6,000 bp genomic window, the full transcript (with 5' and 3' UTRs), and the translated protein have no 1:1 token correspondence, and on the full-transcript tasks the untranslated regions have no protein counterpart. Token streams keep their native lengths; the coding-sequence-derived parts can be placed on the grid, and the rest is pooled, by region where regions are annotated (Section 11.2).</w:t>
       </w:r>
     </w:p>
     <w:p>
@@ -28939,10 +28998,98 @@
     <w:p>
       <w:pPr>
         <w:pStyle w:val="Heading2"/>
+      </w:pPr>
+      <w:r>
+        <w:rPr/>
+        <w:t>11.2 Baselines First: What the Research Plan Reproduces</w:t>
+      </w:r>
+    </w:p>
+    <w:p>
+      <w:pPr>
+        <w:pStyle w:val="ListParagraph"/>
+        <w:spacing w:after="80"/>
+      </w:pPr>
+      <w:r>
+        <w:rPr>
+          <w:b/>
+        </w:rPr>
+        <w:t xml:space="preserve">• Concatenation + MLP (Mandatory Reference): </w:t>
+      </w:r>
+      <w:r>
+        <w:t>Concatenation of pooled or flattened token vectors followed by a 2-layer MLP. This provides the mandatory reference baseline. Any complex recurrent or attention-based fusion module must outperform this baseline to justify its architectural complexity.</w:t>
+      </w:r>
+    </w:p>
+    <w:p>
+      <w:pPr>
+        <w:pStyle w:val="ListParagraph"/>
+        <w:spacing w:after="80"/>
+      </w:pPr>
+      <w:r>
+        <w:rPr>
+          <w:b/>
+        </w:rPr>
+        <w:t xml:space="preserve">• BioLangFusion's architecture, reproduced exactly (research plan item 1): </w:t>
+      </w:r>
+      <w:r>
+        <w:rPr/>
+        <w:t xml:space="preserve">the research plan adds a faithful reproduction of BioLangFusion as the matched baseline for the Stage 3 designs; in its Phase A nothing about the published system is changed. Its three frozen encoders are Nucleotide Transformer v2 100M multi-species (DNA, 6-mer tokens), RNA-FM (mRNA, single-nucleotide tokens), and ESM-2 8M (protein, amino-acid tokens), resampled to the codon grid with the protein stream as the reference frame. Three fusion heads: (1) codon-aware concatenation, where a learnable projection reduces the DNA embedding and the three aligned embeddings are concatenated at each codon position; (2) gated multiple-instance attention with an entropy regularizer, where each modality is projected to a shared latent space, gated attention (tanh × sigmoid) computes one weight per modality from its pooled summary, the fused embedding is the weighted sum, and the loss adds λ·H_attn with λ chosen on validation data from {0.01, 0.5, 1}; (3) cross-modal multi-head attention, where the three projected embeddings are concatenated along the length axis as keys and values, each modality in turn is the query, and outputs are combined with residual averaging and layer normalization. The same fixed TextCNN head, followed by global max pooling and a task-specific fully connected layer, reads every fused representation. Recipe: Adam (learning rate 3e-5, weight decay 1e-5), ReduceLROnPlateau with patience 5, early stopping with patience 20, batch size 32, MSE for regression and cross-entropy for classification, the CodonBERT benchmark splits. Details the paper does not report (TextCNN kernel sizes and filter counts, projection widths, attention heads, maximum epochs, seeds, number of runs) are recorded as explicit deviations with the values chosen and held fixed through Phase B; no official code repository was verified, so the implementation follows the paper and its supplement.</w:t>
+      </w:r>
+    </w:p>
+    <w:p>
+      <w:pPr>
+        <w:pStyle w:val="ListParagraph"/>
+        <w:spacing w:after="80"/>
+      </w:pPr>
+      <w:r>
+        <w:rPr>
+          <w:b/>
+        </w:rPr>
+        <w:t xml:space="preserve">• Pooled and region-aware fusion where no global grid exists: </w:t>
+      </w:r>
+      <w:r>
+        <w:rPr/>
+        <w:t xml:space="preserve">on GTEx, and on the full-transcript tasks where untranslated regions carry signal, each stream is mean-pooled and the vectors concatenated before a two-layer MLP head (on GTEx a multi-output head for all 30 tissues); this is also the reference baseline B4. Where region annotations exist (5' UTR, coding sequence, 3' UTR; on GTEx the window's upstream and downstream halves), each region is pooled separately, the coding-sequence pool is taken from the grid-aligned streams, and a gated attention head weights the region pools before the MLP; the region weights show which region the model draws on. Always beside it: the length and composition baseline (on GTEx the four length features, R² 0.242 on the pilot), the best single encoder, and a same-modality ensemble.</w:t>
+      </w:r>
+    </w:p>
+    <w:p>
+      <w:pPr>
+        <w:pStyle w:val="ListParagraph"/>
+        <w:spacing w:after="80"/>
+      </w:pPr>
+      <w:r>
+        <w:rPr>
+          <w:b/>
+        </w:rPr>
+        <w:t xml:space="preserve">• LucaOne (research plan item 2): </w:t>
+      </w:r>
+      <w:r>
+        <w:rPr/>
+        <w:t xml:space="preserve">a single transformer encoder (about 1.8 billion parameters) pretrained on nucleic acid and protein sequences from 169,861 species with one shared vocabulary of 39 single-character tokens and a token-type embedding that marks nucleotides and amino acids, with masked-language, region-annotation, taxonomy, keyword, and structure objectives. It embeds a nucleic acid and a protein separately (in its own central-dogma experiment the two embeddings are pooled and concatenated), accepts at most 1,280 tokens, and outputs 2,560-dimensional states. It enters as a comparison, not a fusion module: its frozen embeddings on the same folds and under the same head say whether one jointly pretrained model already provides what fusing separately pretrained encoders provides. Its input limit truncates most stability coding sequences and the whole GTEx window, so every result reports what was truncated and what each run cost.</w:t>
+      </w:r>
+    </w:p>
+    <w:p>
+      <w:pPr>
+        <w:pStyle w:val="ListParagraph"/>
+        <w:spacing w:after="80"/>
+      </w:pPr>
+      <w:r>
+        <w:rPr>
+          <w:b/>
+        </w:rPr>
+        <w:t xml:space="preserve">• IsoFormer's aggregator, reproduced on GTEx (baseline): </w:t>
+      </w:r>
+      <w:r>
+        <w:rPr/>
+        <w:t>IsoFormer is not on the research plan's list, but it is the published system for the distinct-molecule question, so it is reproduced as a baseline beside LucaOne: its cross-attention aggregator with frozen encoders (Nucleotide Transformer v2 for the DNA window, each RNA encoder in the transcript role, ESM-2 150M for the protein) on the GTEx pilot and then the full table, scored by R² and Spearman averaged over tissues as IsoFormer reports them, with the four length features beside it (Gantt 44, November 9 to 22). The project's own cross-attention design (Section 11.4) reuses the mechanism later, with the encoders Stage 1 points to and on every task.</w:t>
+      </w:r>
+    </w:p>
+    <w:p>
+      <w:pPr>
+        <w:pStyle w:val="Heading2"/>
         <w:spacing w:before="200" w:after="80"/>
       </w:pPr>
       <w:r>
-        <w:t>11.2 Architecture Priority 1: Coupled Mamba (Recurrent State-Space Fusion)</w:t>
+        <w:t>11.3 Design 1, After the Baselines: Coupled Mamba (Recurrent State-Space Fusion)</w:t>
       </w:r>
     </w:p>
     <w:p>
@@ -29138,7 +29285,7 @@
       </w:r>
       <w:r>
         <w:rPr/>
-        <w:t>the reproduced BioLangFusion heads (Section 11.4) are its matched baseline. Coupled Mamba replaces the fusion head in the reproduced pipeline (same grid, head, splits, and evaluation), first with BioLangFusion's encoders and then with the best encoders from the Phase B swaps of research plan item 1, so that its gain over the three reproduced heads is measured on identical samples and splits. The feasibility tests (Gantt 20) run in parallel with the reproduction (Gantt 17), so neither waits on the other.</w:t>
+        <w:t>the reproduced BioLangFusion heads (Section 11.2) are its matched baseline. Coupled Mamba replaces the fusion head in the reproduced pipeline (same grid, head, splits, and evaluation), first with BioLangFusion's encoders and then with the best encoders from the Phase B swaps of research plan item 1, so that its gain over the three reproduced heads is measured on identical samples and splits. It is built after the research plan's baselines and datasets are in place: feasibility tests (Gantt 20) from January, then the comparison (Gantt 21) against the reproduced heads, LucaOne, and IsoFormer on every dataset of the plan.</w:t>
       </w:r>
     </w:p>
     <w:p>
@@ -29147,16 +29294,12 @@
         <w:spacing w:before="200" w:after="80"/>
       </w:pPr>
       <w:r>
-        <w:t xml:space="preserve">11.3 Architecture Priority 2: </w:t>
-      </w:r>
-      <w:proofErr w:type="spellStart"/>
-      <w:r>
-        <w:t>IsoFormer</w:t>
-      </w:r>
-      <w:proofErr w:type="spellEnd"/>
-      <w:r>
-        <w:t>-Style Cross-Attention</w:t>
-      </w:r>
+        <w:t>11.4 Design 2: IsoFormer-Style Cross-Attention</w:t>
+      </w:r>
+      <w:proofErr w:type="spellStart"/>
+      <w:r/>
+      <w:proofErr w:type="spellEnd"/>
+      <w:r/>
     </w:p>
     <w:p>
       <w:pPr>
@@ -29300,80 +29443,7 @@
       </w:r>
       <w:r>
         <w:rPr/>
-        <w:t xml:space="preserve">its attention weights are a diagnostic: on GTEx the downstream half of the DNA window overlaps the transcript start, so a model that learns a positional correspondence should concentrate transcript-to-DNA attention there (Section 10.10). On GTEx it is trained beside the pooled and region-aware fusion of Section 11.4 and the length baseline; on coding sequence it is compared with Coupled Mamba and the reproduced heads. Gantt ID 25, conditional on the Coupled Mamba result.</w:t>
-      </w:r>
-    </w:p>
-    <w:p>
-      <w:pPr>
-        <w:pStyle w:val="Heading2"/>
-      </w:pPr>
-      <w:r>
-        <w:rPr/>
-        <w:lastRenderedPageBreak/>
-        <w:t xml:space="preserve">11.4 Reference Baselines, and the Two the Research Plan Adds</w:t>
-      </w:r>
-    </w:p>
-    <w:p>
-      <w:pPr>
-        <w:pStyle w:val="ListParagraph"/>
-        <w:spacing w:after="80"/>
-      </w:pPr>
-      <w:r>
-        <w:rPr>
-          <w:b/>
-        </w:rPr>
-        <w:t xml:space="preserve">• Concatenation + MLP (Mandatory Reference): </w:t>
-      </w:r>
-      <w:r>
-        <w:t>Concatenation of pooled or flattened token vectors followed by a 2-layer MLP. This provides the mandatory reference baseline. Any complex recurrent or attention-based fusion module must outperform this baseline to justify its architectural complexity.</w:t>
-      </w:r>
-    </w:p>
-    <w:p>
-      <w:pPr>
-        <w:pStyle w:val="ListParagraph"/>
-        <w:spacing w:after="80"/>
-      </w:pPr>
-      <w:r>
-        <w:rPr>
-          <w:b/>
-        </w:rPr>
-        <w:t xml:space="preserve">• BioLangFusion's architecture, reproduced exactly (research plan item 1): </w:t>
-      </w:r>
-      <w:r>
-        <w:rPr/>
-        <w:t xml:space="preserve">the research plan adds a faithful reproduction of BioLangFusion as the matched baseline for the Stage 3 designs; in its Phase A nothing about the published system is changed. Its three frozen encoders are Nucleotide Transformer v2 100M multi-species (DNA, 6-mer tokens), RNA-FM (mRNA, single-nucleotide tokens), and ESM-2 8M (protein, amino-acid tokens), resampled to the codon grid with the protein stream as the reference frame. Three fusion heads: (1) codon-aware concatenation, where a learnable projection reduces the DNA embedding and the three aligned embeddings are concatenated at each codon position; (2) gated multiple-instance attention with an entropy regularizer, where each modality is projected to a shared latent space, gated attention (tanh × sigmoid) computes one weight per modality from its pooled summary, the fused embedding is the weighted sum, and the loss adds λ·H_attn with λ chosen on validation data from {0.01, 0.5, 1}; (3) cross-modal multi-head attention, where the three projected embeddings are concatenated along the length axis as keys and values, each modality in turn is the query, and outputs are combined with residual averaging and layer normalization. The same fixed TextCNN head, followed by global max pooling and a task-specific fully connected layer, reads every fused representation. Recipe: Adam (learning rate 3e-5, weight decay 1e-5), ReduceLROnPlateau with patience 5, early stopping with patience 20, batch size 32, MSE for regression and cross-entropy for classification, the CodonBERT benchmark splits. Details the paper does not report (TextCNN kernel sizes and filter counts, projection widths, attention heads, maximum epochs, seeds, number of runs) are recorded as explicit deviations with the values chosen and held fixed through Phase B; no official code repository was verified, so the implementation follows the paper and its supplement.</w:t>
-      </w:r>
-    </w:p>
-    <w:p>
-      <w:pPr>
-        <w:pStyle w:val="ListParagraph"/>
-        <w:spacing w:after="80"/>
-      </w:pPr>
-      <w:r>
-        <w:rPr>
-          <w:b/>
-        </w:rPr>
-        <w:t xml:space="preserve">• Pooled and region-aware fusion where no global grid exists: </w:t>
-      </w:r>
-      <w:r>
-        <w:rPr/>
-        <w:t xml:space="preserve">on GTEx, and on the full-transcript tasks where untranslated regions carry signal, each stream is mean-pooled and the vectors concatenated before a two-layer MLP head (on GTEx a multi-output head for all 30 tissues); this is also the reference baseline B4. Where region annotations exist (5' UTR, coding sequence, 3' UTR; on GTEx the window's upstream and downstream halves), each region is pooled separately, the coding-sequence pool is taken from the grid-aligned streams, and a gated attention head weights the region pools before the MLP; the region weights show which region the model draws on. Always beside it: the length and composition baseline (on GTEx the four length features, R² 0.242 on the pilot), the best single encoder, and a same-modality ensemble.</w:t>
-      </w:r>
-    </w:p>
-    <w:p>
-      <w:pPr>
-        <w:pStyle w:val="ListParagraph"/>
-        <w:spacing w:after="80"/>
-      </w:pPr>
-      <w:r>
-        <w:rPr>
-          <w:b/>
-        </w:rPr>
-        <w:t xml:space="preserve">• LucaOne (research plan item 2): </w:t>
-      </w:r>
-      <w:r>
-        <w:rPr/>
-        <w:t xml:space="preserve">a single transformer encoder (about 1.8 billion parameters) pretrained on nucleic acid and protein sequences from 169,861 species with one shared vocabulary of 39 single-character tokens and a token-type embedding that marks nucleotides and amino acids, with masked-language, region-annotation, taxonomy, keyword, and structure objectives. It embeds a nucleic acid and a protein separately (in its own central-dogma experiment the two embeddings are pooled and concatenated), accepts at most 1,280 tokens, and outputs 2,560-dimensional states. It enters as a comparison, not a fusion module: its frozen embeddings on the same folds and under the same head say whether one jointly pretrained model already provides what fusing separately pretrained encoders provides. Its input limit truncates most stability coding sequences and the whole GTEx window, so every result reports what was truncated and what each run cost.</w:t>
+        <w:t>its attention weights are a diagnostic: on GTEx the downstream half of the DNA window overlaps the transcript start, so a model that learns a positional correspondence should concentrate transcript-to-DNA attention there (Section 10.10). On GTEx it is trained beside the pooled and region-aware fusion of Section 11.2 and the length baseline; on coding sequence it is compared with Coupled Mamba and the reproduced heads. Gantt ID 25, after Coupled Mamba (February).</w:t>
       </w:r>
     </w:p>
     <w:p>
@@ -29658,11 +29728,11 @@
         <w:rPr>
           <w:b/>
         </w:rPr>
-        <w:t xml:space="preserve">• Tier 2: Deep Token-Level Fusion and Baselines: </w:t>
+        <w:t xml:space="preserve">• Tier 2: The Research Plan's Baselines: </w:t>
       </w:r>
       <w:r>
         <w:rPr/>
-        <w:t>Reproduce BioLangFusion and IsoFormer (Section 12.7; Gantt 17), the BioLangFusion reproduction faithful on all five published benchmarks (plan item 1, Phase A); train full token-level Coupled Mamba (Gantt 20 and 21) and IsoFormer cross-attention (Gantt 25) models on selected combinations (including both high-synergy and low-synergy controls) against the reproduced heads; LucaOne beside them (plan item 2, Gantt 41).</w:t>
+        <w:t>BioLangFusion reproduced exactly on all five published benchmarks (plan item 1, Phase A; Gantt 17), then its encoders swapped one at a time (Phase B; Gantt 24); LucaOne's frozen embeddings (plan item 2; Gantt 41); and IsoFormer's aggregator reproduced on GTEx (Gantt 44).</w:t>
       </w:r>
     </w:p>
     <w:p>
@@ -29674,11 +29744,11 @@
         <w:rPr>
           <w:b/>
         </w:rPr>
-        <w:t xml:space="preserve">• Tier 3: Systematic Ablations: </w:t>
+        <w:t xml:space="preserve">• Tier 3: The Research Plan's Datasets: </w:t>
       </w:r>
       <w:r>
         <w:rPr/>
-        <w:t>Run systematic ablations: alignment loss penalty weights (Gantt 23), modality dropping/reinitialization, codon grid necessity, LoRA adaptation, and the encoder swaps of plan item 1, Phase B (Gantt 24, now planned rather than conditional).</w:t>
+        <w:t>Half-life and translation efficiency on the mRNABench splits after the gates of plan items 3 and 4 (Gantt 42, November 23 to December 20), with every Tier 2 baseline run on them.</w:t>
       </w:r>
     </w:p>
     <w:p>
@@ -29690,11 +29760,43 @@
         <w:rPr>
           <w:b/>
         </w:rPr>
-        <w:t xml:space="preserve">• Tier 4: Generalization &amp; Published Benchmarking: </w:t>
+        <w:t xml:space="preserve">• Tier 4: The Project's Designs, After the Baselines: </w:t>
       </w:r>
       <w:r>
         <w:rPr/>
-        <w:t>Evaluate generalization on external benchmarks (mRNABench half-life and translation efficiency after the gates of plan items 3 and 4, Gantt 42; the protein-to-mRNA ratio, the CaLM suite, the rest of mRNABench) and compare against published BioLangFusion and IsoFormer numbers (Gantt 29 and 38). The optional structure extension (plan item 6, Gantt 38) and the distillation idea (plan item 7, Gantt 43) come after the core comparisons.</w:t>
+        <w:t>Coupled Mamba (Gantt 20 and 21), then cross-attention (Gantt 25), from January, on selected combinations including high-synergy and low-synergy controls, scored against every baseline on every dataset.</w:t>
+      </w:r>
+    </w:p>
+    <w:p>
+      <w:pPr>
+        <w:pStyle w:val="ListParagraph"/>
+        <w:spacing w:after="80"/>
+      </w:pPr>
+      <w:r>
+        <w:rPr>
+          <w:b/>
+        </w:rPr>
+        <w:t xml:space="preserve">• Tier 5: Systematic Ablations: </w:t>
+      </w:r>
+      <w:r>
+        <w:rPr/>
+        <w:t>Alignment-loss penalty weights (Gantt 23), modality dropping and reinitialization, codon-grid necessity, and LoRA adaptation.</w:t>
+      </w:r>
+    </w:p>
+    <w:p>
+      <w:pPr>
+        <w:pStyle w:val="ListParagraph"/>
+        <w:spacing w:after="80"/>
+      </w:pPr>
+      <w:r>
+        <w:rPr>
+          <w:b/>
+        </w:rPr>
+        <w:t xml:space="preserve">• Tier 6: Generalization, Published Benchmarking, and the Plan's Later Items: </w:t>
+      </w:r>
+      <w:r>
+        <w:rPr/>
+        <w:t>The protein-to-mRNA ratio, the CaLM suite, the rest of mRNABench, and comparison against the published BioLangFusion and IsoFormer numbers (Gantt 29 and 38); then the optional structure extension (plan item 6, Gantt 38) and the distillation idea (plan item 7, Gantt 43), in March.</w:t>
       </w:r>
     </w:p>
     <w:p>
@@ -33654,7 +33756,7 @@
       <w:proofErr w:type="spellEnd"/>
       <w:r>
         <w:rPr/>
-        <w:t>Order of work: the three sets in hand first (stability, mRFP, the GTEx pilot), then the fungal and E. coli files from the CodonBERT repository together with Ab1 and CoV-Vac, since all five are needed for the BioLangFusion reproduction (research plan item 1); then the two large transcript-level sets with codon tracks, half-life and translation efficiency, on the mRNABench splits once they pass the gates (research plan items 3 and 4); then the protein-to-mRNA ratio and the CaLM suite; then the rest of mRNABench, which supplies splits and a leaderboard; and the two single-region sets as nucleotide-only controls. Every task reports the baseline hierarchy below and the Stage 1 alignment measurements of each fused pair.</w:t>
+        <w:t>Order of work: the three sets in hand first (stability, mRFP, the GTEx pilot), then the fungal and E. coli files from the CodonBERT repository together with Ab1 and CoV-Vac, since all five are needed for the BioLangFusion reproduction (research plan item 1); then the two large transcript-level sets with codon tracks, half-life and translation efficiency, on the mRNABench splits once they pass the gates (research plan items 3 and 4); then the protein-to-mRNA ratio and the CaLM suite; then the rest of mRNABench, which supplies splits and a leaderboard; and the two single-region sets as nucleotide-only controls. Every task reports the baseline hierarchy below and the Stage 1 alignment measurements of each fused pair. The project's designs run only after the research plan's baselines exist on the first two groups of datasets.</w:t>
       </w:r>
     </w:p>
     <w:p>
@@ -33804,7 +33906,7 @@
       </w:r>
       <w:r>
         <w:rPr/>
-        <w:t>Train all 7 non-empty subsets of DNA, RNA, and protein; calculate Shapley values per modality; and test zero-out modality dropping at inference time to confirm the model does not collapse onto a single dominant encoder. The gated-attention head's modality weights give the same reading for free. The ablations are the Gantt chart's ablation items (IDs 22 to 24) plus the modality and counterfactual tests; each runs inside the reproduced pipeline, so that it changes exactly one thing.</w:t>
+        <w:t>Train all 7 non-empty subsets of DNA, RNA, and protein; calculate Shapley values per modality; and test zero-out modality dropping at inference time to confirm the model does not collapse onto a single dominant encoder. The gated-attention head's modality weights give the same reading for free. The ablations are the Gantt chart's ablation items (IDs 22 and 23) plus the modality and counterfactual tests; each runs inside the reproduced pipeline, so that it changes exactly one thing.</w:t>
       </w:r>
     </w:p>
     <w:p>
@@ -34104,7 +34206,7 @@
       </w:pPr>
       <w:r>
         <w:rPr/>
-        <w:t>12.8 What the Research Plan Adds, and Where Each Item Slots In</w:t>
+        <w:t>12.8 The Research Plan Comes First: Each Item and Where It Slots In</w:t>
       </w:r>
     </w:p>
     <w:p>
@@ -34127,7 +34229,7 @@
       <w:proofErr w:type="spellEnd"/>
       <w:r>
         <w:rPr/>
-        <w:t>The research plan adds seven numbered items to this design, and the project carries them out as the plan states them, in its order and under its numbers, on top of the work already done: (1) Priority 1, reproduce BioLangFusion exactly (Phase A), then change the encoders only (Phase B); (2) Priority 2, LucaOne; (3) Priority 3, full-transcript half-life; (4) Priority 4, translation efficiency; (5) a low-cost control run in parallel, mRFP synonymous expression; (6) an optional extension, structure representations; (7) an exploratory direction, multi-teacher distillation, to think through before the meeting and not implement yet. None replaces a planned item: Coupled Mamba stays the priority architecture, the tiers and the ablations stand, and the task set keeps its order. Each item sharpens the design in one way: the reproduction gives Coupled Mamba a matched published baseline on identical splits, and its encoder swaps are the cleanest test of H2; LucaOne tests whether joint pretraining already does what fusion does; the half-life and translation-efficiency tasks and their label gates make tests 3 and 4 precise; the mRFP control holds the protein constant; structure enters only where it plausibly acts; and the distillation idea is one Stage 1 already has something to say about. Gantt IDs are as of October 15 and subject to change.</w:t>
+        <w:t>The research plan adds seven numbered items to this design, and the project carries them out as the plan states them, in its order and under its numbers, on top of the work already done: (1) Priority 1, reproduce BioLangFusion exactly (Phase A), then change the encoders only (Phase B); (2) Priority 2, LucaOne; (3) Priority 3, full-transcript half-life; (4) Priority 4, translation efficiency; (5) a low-cost control run in parallel, mRFP synonymous expression; (6) an optional extension, structure representations; (7) an exploratory direction, multi-teacher distillation, to think through before the meeting and not implement yet. None replaces a planned item: Coupled Mamba stays the project's first design and cross-attention its second, the ablations stand, and the task set keeps its order; what the plan changes is the order of work. Items 1 to 5, together with IsoFormer reproduced on GTEx, come before the project's designs, so that every baseline and dataset the plan names is in place before Coupled Mamba and cross-attention are trained; items 6 and 7 come after them. Each item sharpens the design in one way: the reproduction gives Coupled Mamba a matched published baseline on identical splits, and its encoder swaps are the cleanest test of H2; LucaOne tests whether joint pretraining already does what fusion does; the half-life and translation-efficiency tasks and their label gates make tests 3 and 4 precise; the mRFP control holds the protein constant; structure enters only where it plausibly acts; and the distillation idea is one Stage 1 already has something to say about. Gantt IDs are as of October 15 and subject to change.</w:t>
       </w:r>
     </w:p>
     <w:p>
@@ -34143,7 +34245,7 @@
       </w:r>
       <w:r>
         <w:rPr/>
-        <w:t>implement the input preparation and codon resampling, the three original encoders, all three fusion heads, and the TextCNN head (Section 11.4), with the published splits, training recipe, hyperparameters, metrics, and preprocessing followed as closely as possible, and every unavailable detail recorded as an explicit deviation. Run every benchmark the paper reports, with the published values to match: Fungal (Wint 2022; expression; Spearman; 7,056 raw, 3,138 used): NT 0.804, RNA-FM 0.767, ESM-2 8M 0.695, best fused 0.824 (MIL). E. coli (Ding 2022; low, medium, high expression; accuracy; 6,348 raw, 4,450 used): 41.29, 52.95, 49.02; best fused 53.93 (cross-attention). mRNA stability (Diez 2022; Spearman; 65,356 raw, 23,929 used): 0.530, 0.553, 0.539; best fused 0.563 (MIL). Ab1 (Yazdani 2024; protein expression of antibody-encoding mRNA; Spearman; 723 sequences up to 1,203 nt): 0.732, 0.743, 0.711; best fused 0.765 (cross-attention). CoV-Vac (Leppek 2022; degradation of 2,400 designed fragments up to 81 nt; Spearman): 0.780, 0.841, 0.806; best fused 0.864 (MIL). Concatenation scores 0.805, 50.28, 0.539, 0.764, and 0.831 in the same order; the paper reports no variance. Confirm the exact dataset releases and split artifacts before training. Slots into Tier 2: it widens Gantt 17 (October 12 to 25) from matched comparisons on the project's data to the published benchmarks, and it is the matched baseline for Coupled Mamba (Gantt 21).</w:t>
+        <w:t>implement the input preparation and codon resampling, the three original encoders, all three fusion heads, and the TextCNN head (Section 11.2), with the published splits, training recipe, hyperparameters, metrics, and preprocessing followed as closely as possible, and every unavailable detail recorded as an explicit deviation. Run every benchmark the paper reports, with the published values to match: Fungal (Wint 2022; expression; Spearman; 7,056 raw, 3,138 used): NT 0.804, RNA-FM 0.767, ESM-2 8M 0.695, best fused 0.824 (MIL). E. coli (Ding 2022; low, medium, high expression; accuracy; 6,348 raw, 4,450 used): 41.29, 52.95, 49.02; best fused 53.93 (cross-attention). mRNA stability (Diez 2022; Spearman; 65,356 raw, 23,929 used): 0.530, 0.553, 0.539; best fused 0.563 (MIL). Ab1 (Yazdani 2024; protein expression of antibody-encoding mRNA; Spearman; 723 sequences up to 1,203 nt): 0.732, 0.743, 0.711; best fused 0.765 (cross-attention). CoV-Vac (Leppek 2022; degradation of 2,400 designed fragments up to 81 nt; Spearman): 0.780, 0.841, 0.806; best fused 0.864 (MIL). Concatenation scores 0.805, 50.28, 0.539, 0.764, and 0.831 in the same order; the paper reports no variance. Confirm the exact dataset releases and split artifacts before training. Slots into Tier 2: it widens Gantt 17 (October 12 to 25) from matched comparisons on the project's data to the published benchmarks, and it is the matched baseline for Coupled Mamba (Gantt 21).</w:t>
       </w:r>
     </w:p>
     <w:p>
@@ -34191,7 +34293,7 @@
       </w:r>
       <w:r>
         <w:rPr/>
-        <w:t>RNA half-life, Saluki human and mouse (rnahl-saluki-human, rnahl-saluki-mouse), and the LBKWK half-life target (mrl-hl-lbkwk); neither is MRL Sugimoto, which measures mean ribosome load, and each runs separately on its own published split and metric. The stability benchmark covers coding sequence only, omitting the regulatory regions that may contribute to mRNA stability. Gate first: 5' and 3' UTRs and coding-sequence coordinates present, with labels, species, and non-leaking grouped splits; if transcript regions are absent the task is not treated as a full-transcript test. Then compare coding sequence only, coding sequence plus 3' UTR, and the full transcript, each encoded by the nucleotide encoders, with protein-derived representations added for the same coding region; matched samples and folds; best unimodal, fusion, and simple length and composition baselines. Conclusion: the incremental predictive value of transcript regions and of fusion; no claim of separate molecular measurements from sequence-derived inputs. Slots into Tier 4: Gantt 42 (January 4 to February 28, conditional), or earlier if the gate passes and cluster time allows.</w:t>
+        <w:t>RNA half-life, Saluki human and mouse (rnahl-saluki-human, rnahl-saluki-mouse), and the LBKWK half-life target (mrl-hl-lbkwk); neither is MRL Sugimoto, which measures mean ribosome load, and each runs separately on its own published split and metric. The stability benchmark covers coding sequence only, omitting the regulatory regions that may contribute to mRNA stability. Gate first: 5' and 3' UTRs and coding-sequence coordinates present, with labels, species, and non-leaking grouped splits; if transcript regions are absent the task is not treated as a full-transcript test. Then compare coding sequence only, coding sequence plus 3' UTR, and the full transcript, each encoded by the nucleotide encoders, with protein-derived representations added for the same coding region; matched samples and folds; best unimodal, fusion, and simple length and composition baselines. Conclusion: the incremental predictive value of transcript regions and of fusion; no claim of separate molecular measurements from sequence-derived inputs. Slots into Tier 3: Gantt 42 (November 23 to December 20), after the gate and before the project's designs, so that every baseline is also scored on these tasks.</w:t>
       </w:r>
     </w:p>
     <w:p>
@@ -34207,7 +34309,7 @@
       </w:r>
       <w:r>
         <w:rPr/>
-        <w:t>translation efficiency, human and mouse (translation-efficiency-human, translation-efficiency-mouse), is TE and is not relabeled as ribosome load; MRL Sugimoto and the LBKWK MRL target are mean ribosome load, not half-life; each target runs separately under its original evaluation protocol. Initiation and elongation depend on different sequence features, so the task tests whether RNA-, codon-, and protein-derived representations are complementary. Gate first: the measured target confirmed (TE or mean ribosome load), full transcript, UTR, and coding-sequence coordinates available, the experimental context and grouped splits valid, and TE not conflated with protein abundance. Then compare the 5' UTR, coding sequence, full transcript, full transcript plus protein, and the three-encoder fusion, with RiboNN as the external benchmark where task-compatible; coding-sequence-derived streams aligned on the codon grid where possible, untranslated regions handled separately, and the gain reported over the best full-transcript baseline. MIMIC (Golkar et al., 2026) motivates these benchmarks but does not show that fusion of separately pretrained encoders will improve them. Slots into Tier 4: Gantt 42 with item 3.</w:t>
+        <w:t>translation efficiency, human and mouse (translation-efficiency-human, translation-efficiency-mouse), is TE and is not relabeled as ribosome load; MRL Sugimoto and the LBKWK MRL target are mean ribosome load, not half-life; each target runs separately under its original evaluation protocol. Initiation and elongation depend on different sequence features, so the task tests whether RNA-, codon-, and protein-derived representations are complementary. Gate first: the measured target confirmed (TE or mean ribosome load), full transcript, UTR, and coding-sequence coordinates available, the experimental context and grouped splits valid, and TE not conflated with protein abundance. Then compare the 5' UTR, coding sequence, full transcript, full transcript plus protein, and the three-encoder fusion, with RiboNN as the external benchmark where task-compatible; coding-sequence-derived streams aligned on the codon grid where possible, untranslated regions handled separately, and the gain reported over the best full-transcript baseline. MIMIC (Golkar et al., 2026) motivates these benchmarks but does not show that fusion of separately pretrained encoders will improve them. Slots into Tier 3: Gantt 42 with item 3 (November 23 to December 20).</w:t>
       </w:r>
     </w:p>
     <w:p>
@@ -34271,7 +34373,7 @@
       <w:proofErr w:type="spellEnd"/>
       <w:r>
         <w:rPr/>
-        <w:t xml:space="preserve">Run after the core benchmarks (Gantt 38, conditional), and only on tasks where structure plausibly affects the target. Protein: on a structure-relevant task, compare sequence-only, sequence plus ESMFold single-sequence structural features, and sequence plus AlphaFold2 MSA-informed features, controlling for MSA input, model confidence, and model differences; structure-based gains do not alone establish independent information. RNA: on half-life or translation efficiency, compare RNA sequence embeddings alone with sequence plus predicted secondary-structure features (paired or unpaired state, base-pair probabilities, accessibility), a thermodynamic baseline (RNAfold) against learned alternatives (EternaFold, MXfold2), on identical regions and splits; experimentally probed structures, where available, are the stronger control. Report gains over sequence-only and over simple structure-feature baselines, and do not reject either structural representation on a negative GTEx expression result alone.</w:t>
+        <w:t>Run after the core benchmarks and the project's designs (Gantt 38, March, conditional), and only on tasks where structure plausibly affects the target. Protein: on a structure-relevant task, compare sequence-only, sequence plus ESMFold single-sequence structural features, and sequence plus AlphaFold2 MSA-informed features, controlling for MSA input, model confidence, and model differences; structure-based gains do not alone establish independent information. RNA: on half-life or translation efficiency, compare RNA sequence embeddings alone with sequence plus predicted secondary-structure features (paired or unpaired state, base-pair probabilities, accessibility), a thermodynamic baseline (RNAfold) against learned alternatives (EternaFold, MXfold2), on identical regions and splits; experimentally probed structures, where available, are the stronger control. Report gains over sequence-only and over simple structure-feature baselines, and do not reject either structural representation on a negative GTEx expression result alone.</w:t>
       </w:r>
     </w:p>
     <w:p>
@@ -34415,7 +34517,7 @@
       </w:r>
       <w:r>
         <w:rPr/>
-        <w:t>it is a Stage 4 follow-up after the core BioLangFusion reproduction and encoder swaps, a compression and ensembling experiment that asks whether the diversity of the teachers survives in a small student, scored with the same held-out gains as everything else. Following the plan's implementation checklist: (1) settle the teacher set, the twelve Stage 1 encoders plus two DNA encoders and one RNA encoder; (2) pin teacher checkpoints, sequence normalization, tokenizer versions, truncation, and pooling, and check that sample IDs refer to the same sequences across a modality's teachers; (3) build the leakage-free unlabeled pools and cache the teacher embeddings; (4) train each student with the plan's objective, starting with RNA as in the plan's worked example, then DNA and protein, with the composition-controlled target reported beside the raw one; (5) evaluate each student, then train the fusion head and report Δstudent and Δteacher with cost, on the five BioLangFusion benchmarks with the reproduced heads so that the results sit beside the Phase B numbers and Coupled Mamba. Gantt 43 (January 4 to February 28), conditional, after the core comparisons.</w:t>
+        <w:t>it is a Stage 4 follow-up after the core BioLangFusion reproduction and encoder swaps, a compression and ensembling experiment that asks whether the diversity of the teachers survives in a small student, scored with the same held-out gains as everything else. Following the plan's implementation checklist: (1) settle the teacher set, the twelve Stage 1 encoders plus two DNA encoders and one RNA encoder; (2) pin teacher checkpoints, sequence normalization, tokenizer versions, truncation, and pooling, and check that sample IDs refer to the same sequences across a modality's teachers; (3) build the leakage-free unlabeled pools and cache the teacher embeddings; (4) train each student with the plan's objective, starting with RNA as in the plan's worked example, then DNA and protein, with the composition-controlled target reported beside the raw one; (5) evaluate each student, then train the fusion head and report Δstudent and Δteacher with cost, on the five BioLangFusion benchmarks with the reproduced heads so that the results sit beside the Phase B numbers and Coupled Mamba. Gantt 43 (March), conditional, after the core comparisons and the project's designs.</w:t>
       </w:r>
     </w:p>
     <w:p>
@@ -34560,7 +34662,7 @@
       <w:proofErr w:type="spellEnd"/>
       <w:r>
         <w:rPr/>
-        <w:t>• Experimental design: the Stage 2 decision and the fusion gain Δfusion; the three Stage 3 designs, Coupled Mamba first; the research plan's seven items in its order and where each slots into the tiers and the Gantt chart: (1) BioLangFusion reproduced exactly on its five benchmarks with the published values to match, then one encoder changed at a time; (2) LucaOne; (3) half-life and (4) translation efficiency on the mRNABench splits with their gates and label distinctions; (5) the mRFP control; (6) structure; the baseline hierarchy; the task-coverage matrix; and (7) what Stage 1 says about the distillation idea.</w:t>
+        <w:t>• Experimental design: the Stage 2 decision and the fusion gain Δfusion; the research plan first, then the Stage 3 designs (Coupled Mamba, then cross-attention, from January); the research plan's seven items in its order and where each slots into the tiers and the Gantt chart: (1) BioLangFusion reproduced exactly on its five benchmarks with the published values to match, then one encoder changed at a time; (2) LucaOne; (3) half-life and (4) translation efficiency on the mRNABench splits with their gates and label distinctions; (5) the mRFP control; (6) structure; the baseline hierarchy; the task-coverage matrix; and (7) what Stage 1 says about the distillation idea.</w:t>
       </w:r>
     </w:p>
     <w:p>
@@ -34637,7 +34739,7 @@
       <w:proofErr w:type="spellEnd"/>
       <w:r>
         <w:rPr/>
-        <w:t>• 3. Where the seven items sit in the Gantt chart, in her implementation order: ID 17 widened (October 12 to 25) to the faithful reproduction on all five published datasets; the encoder swaps directly after it, ID 24 (October 26 to November 8), planned rather than conditional; then LucaOne, ID 41 (November 9 to 22); the mRFP control in parallel in ID 18; the half-life and translation-efficiency tasks in ID 42 and distillation in ID 43 (January to February, conditional); structure in ID 38. Does that order and timing work?</w:t>
+        <w:t>• 3. Where the seven items sit in the Gantt chart, in her implementation order: ID 17 widened (October 12 to 25) to the faithful reproduction on all five published datasets; the encoder swaps directly after it, ID 24 (October 26 to November 8), planned rather than conditional; then LucaOne, ID 41 (November 9 to 22); the mRFP control in parallel in ID 18; IsoFormer on GTEx beside it, ID 44; the half-life and translation-efficiency tasks in ID 42 (November 23 to December 20); then Coupled Mamba (20, 21) and cross-attention (25) from January; structure (38) and distillation (43) in March, conditional. Does that order and timing work?</w:t>
       </w:r>
     </w:p>
     <w:p>

</xml_diff>

<commit_message>
Organize Code by stage: stage1, stage3, stage4, shared_code/fusion; update paths, tests and docs
</commit_message>
<xml_diff>
--- a/docs/notes/Mina_Project_Notes.docx
+++ b/docs/notes/Mina_Project_Notes.docx
@@ -96,7 +96,7 @@
         <w:t>Source of results:</w:t>
       </w:r>
       <w:r>
-        <w:t xml:space="preserve"> every Stage 1 number reported here comes from the saved outputs of Code/Stage1_stability.ipynb and Code/Stage1_gtex.ipynb in the project repository (multimodal-bio-fusion on GitHub).</w:t>
+        <w:t xml:space="preserve"> every Stage 1 number reported here comes from the saved outputs of Code/stage1/Stage1_stability.ipynb and Code/stage1/Stage1_gtex.ipynb in the project repository (multimodal-bio-fusion on GitHub).</w:t>
       </w:r>
     </w:p>
     <w:p>
@@ -3074,7 +3074,7 @@
       </w:r>
       <w:proofErr w:type="spellEnd"/>
       <w:r>
-        <w:t xml:space="preserve"> on Hugging Face) provides, per transcript, genomic DNA centered on the transcription start site, the full transcript with UTRs, the protein, and expression across tissues, with a fixed gene-level split. There, DNA carries promoter and regulatory context the protein lacks. It is the second Stage 1 dataset: a 2,000-transcript pilot (1,000 from each published split, built by Code/build_gtex_pilot.py) lets the Stage 1 measurements be compared between derived modalities (stability) and genuinely distinct ones (</w:t>
+        <w:t xml:space="preserve"> on Hugging Face) provides, per transcript, genomic DNA centered on the transcription start site, the full transcript with UTRs, the protein, and expression across tissues, with a fixed gene-level split. There, DNA carries promoter and regulatory context the protein lacks. It is the second Stage 1 dataset: a 2,000-transcript pilot (1,000 from each published split, built by Code/stage1/build_gtex_pilot.py) lets the Stage 1 measurements be compared between derived modalities (stability) and genuinely distinct ones (</w:t>
       </w:r>
       <w:proofErr w:type="spellStart"/>
       <w:r>
@@ -7930,7 +7930,7 @@
         <w:spacing w:after="160"/>
       </w:pPr>
       <w:r>
-        <w:t xml:space="preserve">All results come from the saved outputs of Code/Stage1_stability.ipynb and Code/Stage1_gtex.ipynb (run on an Apple GPU through </w:t>
+        <w:t xml:space="preserve">All results come from the saved outputs of Code/stage1/Stage1_stability.ipynb and Code/stage1/Stage1_gtex.ipynb (run on an Apple GPU through </w:t>
       </w:r>
       <w:proofErr w:type="spellStart"/>
       <w:r>
@@ -20866,10 +20866,10 @@
           <w:b/>
           <w:bCs/>
         </w:rPr>
-        <w:t>Pilot:</w:t>
-      </w:r>
-      <w:r>
-        <w:t xml:space="preserve"> Code/build_gtex_pilot.py samples 1,000 protein-coding transcripts from each of </w:t>
+        <w:t>Pilot: Code/stage1/build_gtex_pilot.py samples</w:t>
+      </w:r>
+      <w:r>
+        <w:t xml:space="preserve"> 1,000 protein-coding transcripts from each of </w:t>
       </w:r>
       <w:proofErr w:type="spellStart"/>
       <w:r>

</xml_diff>

<commit_message>
Stage 3 steps 3 and 4 results; sync notes, Gantt, deck and README to October 19
Co-Authored-By: Claude Opus 5.5 <noreply@anthropic.com>

Claude-Session: https://claude.ai/code/session_01A54DUp2K2ADqzEJ7zvsPHg
</commit_message>
<xml_diff>
--- a/docs/notes/Mina_Project_Notes.docx
+++ b/docs/notes/Mina_Project_Notes.docx
@@ -175,7 +175,7 @@
       <w:proofErr w:type="spellEnd"/>
       <w:r>
         <w:rPr/>
-        <w:t xml:space="preserve">Stage 1 (Representation Analysis) is complete for twelve frozen encoders, four per modality, on two datasets: a 981-sequence pilot of mRNA_Stability, where every input derives from one coding sequence, and a 2,000-transcript pilot of IsoFormer's GTEx data, where DNA, transcript, and protein are different molecules. Nucleotide Transformer 500M human-ref, Nucleotide Transformer v2 100M multi-species, DNABERT-2, and HyenaDNA are the DNA encoders; RNA-FM and RiNALMo (one token per nucleotide) and mRNA-FM and CaLM (one token per codon) the RNA encoders; and ESM-2 8M, 35M, and 150M and ProtBERT the protein encoders. Stage 2 (Define Alignment) is decided and states what alignment means in biology (Section 10), Stage 3 (Fusion Architecture Design) specifies candidate models (Section 11), and Stage 4 (Experimental Design &amp; Benchmarking) sets out the testing campaign, the BioLangFusion and IsoFormer baselines, and the task-specific datasets (Section 12). The Overleaf manuscript holds the full Stage 1 record with 18 figures, every table, and a reading guide that defines each method. Mina is reviewing it ahead of the October 20, 2026 meeting, where the team presents the important findings and the experimental design (Section 13).</w:t>
+        <w:t>Stage 1 (Representation Analysis) is complete for twelve frozen encoders, four per modality, on two datasets: a 981-sequence pilot of mRNA_Stability, where every input derives from one coding sequence, and a 2,000-transcript pilot of IsoFormer's GTEx data, where DNA, transcript, and protein are different molecules. Nucleotide Transformer 500M human-ref, Nucleotide Transformer v2 100M multi-species, DNABERT-2, and HyenaDNA are the DNA encoders; RNA-FM and RiNALMo (one token per nucleotide) and mRNA-FM and CaLM (one token per codon) the RNA encoders; and ESM-2 8M, 35M, and 150M and ProtBERT the protein encoders. Stage 2 (Define Alignment) is decided and states what alignment means in biology (Section 10), Stage 3 (Fusion Architecture Design) specifies candidate models (Section 11), and Stage 4 (Experimental Design &amp; Benchmarking) sets out the testing campaign, the BioLangFusion and IsoFormer baselines, and the task-specific datasets (Section 12). The Overleaf manuscript holds the full Stage 1 record with 18 figures, every table, and a reading guide that defines each method. Mina is reviewing it ahead of the October 22, 2026 meeting, where the team presents the important findings and the experimental design (Section 13).</w:t>
       </w:r>
     </w:p>
     <w:p>
@@ -459,7 +459,7 @@
       </w:r>
       <w:r>
         <w:rPr/>
-        <w:t xml:space="preserve">Remaining: confirm the framing with Mina on October 20; the learned-retrieval measurement.</w:t>
+        <w:t>Remaining: confirm the framing with Mina on October 22; the learned-retrieval measurement.</w:t>
       </w:r>
     </w:p>
     <w:p>
@@ -475,11 +475,11 @@
         <w:rPr>
           <w:b/>
         </w:rPr>
-        <w:t xml:space="preserve">Stage 3 (Overleaf 11; notes 11): designed, not built. </w:t>
+        <w:t xml:space="preserve">Stage 3 (Overleaf 11; notes 11): first round built and run. </w:t>
       </w:r>
       <w:r>
         <w:rPr/>
-        <w:t>The research plan first: the BioLangFusion reproduction with token-level embeddings (Gantt 17), the encoder swaps (24), LucaOne (41), and IsoFormer on GTEx (44); Coupled Mamba (20, 21) and cross-attention (25) follow, from January.</w:t>
+        <w:t>Notebooks 01 to 04 in Code/stage3 ran October 15 to 19: the four BioLangFusion benchmarks with their token-level embeddings; the BioLangFusion model checked on fungal expression (Gantt 17, one benchmark of four so far); LucaOne's input limit measured (41); and IsoFormer's aggregator run on the GTEx pilot with frozen encoders (44). Remaining in the research plan: Phase A on E. coli, CoV-Vac and mRNA stability, then the encoder swaps (24). Coupled Mamba (20, 21) and cross-attention (25) follow, from January.</w:t>
       </w:r>
     </w:p>
     <w:p>
@@ -29032,7 +29032,7 @@
       </w:r>
       <w:r>
         <w:rPr/>
-        <w:t xml:space="preserve">the research plan adds a faithful reproduction of BioLangFusion as the matched baseline for the Stage 3 designs; in its Phase A nothing about the published system is changed. Its three frozen encoders are Nucleotide Transformer v2 100M multi-species (DNA, 6-mer tokens), RNA-FM (mRNA, single-nucleotide tokens), and ESM-2 8M (protein, amino-acid tokens), resampled to the codon grid with the protein stream as the reference frame. Three fusion heads: (1) codon-aware concatenation, where a learnable projection reduces the DNA embedding and the three aligned embeddings are concatenated at each codon position; (2) gated multiple-instance attention with an entropy regularizer, where each modality is projected to a shared latent space, gated attention (tanh × sigmoid) computes one weight per modality from its pooled summary, the fused embedding is the weighted sum, and the loss adds λ·H_attn with λ chosen on validation data from {0.01, 0.5, 1}; (3) cross-modal multi-head attention, where the three projected embeddings are concatenated along the length axis as keys and values, each modality in turn is the query, and outputs are combined with residual averaging and layer normalization. The same fixed TextCNN head, followed by global max pooling and a task-specific fully connected layer, reads every fused representation. Recipe: Adam (learning rate 3e-5, weight decay 1e-5), ReduceLROnPlateau with patience 5, early stopping with patience 20, batch size 32, MSE for regression and cross-entropy for classification, the CodonBERT benchmark splits. Details the paper does not report (TextCNN kernel sizes and filter counts, projection widths, attention heads, maximum epochs, seeds, number of runs) are recorded as explicit deviations with the values chosen and held fixed through Phase B; no official code repository was verified, so the implementation follows the paper and its supplement.</w:t>
+        <w:t>the research plan adds a faithful reproduction of BioLangFusion as the matched baseline for the Stage 3 designs; in its Phase A nothing about the published system is changed. Its three frozen encoders are Nucleotide Transformer v2 100M multi-species (DNA, 6-mer tokens), RNA-FM (mRNA, single-nucleotide tokens), and ESM-2 8M (protein, amino-acid tokens), resampled to the codon grid with the protein stream as the reference frame. Three fusion heads: (1) codon-aware concatenation, where a learnable projection reduces the DNA embedding and the three aligned embeddings are concatenated at each codon position; (2) gated multiple-instance attention with an entropy regularizer, where each modality is projected to a shared latent space, gated attention (tanh × sigmoid) computes one weight per modality from its pooled summary, the fused embedding is the weighted sum, and the loss adds λ·H_attn with λ chosen on validation data from {0.01, 0.5, 1}; (3) cross-modal multi-head attention, where the three projected embeddings are concatenated along the length axis as keys and values, each modality in turn is the query, and outputs are combined with residual averaging and layer normalization. The same fixed TextCNN head, followed by global max pooling and a task-specific fully connected layer, reads every fused representation. Recipe: Adam (learning rate 3e-5, weight decay 1e-5), ReduceLROnPlateau with patience 5, early stopping with patience 20, batch size 32, MSE for regression and cross-entropy for classification, the CodonBERT benchmark splits. The appendix reports most of the architecture: TextCNN kernel sizes 3, 4, and 5, a projection width of 600, four heads for cross-attention, and at most 500 epochs. It is inconsistent in two places that a reproduction has to resolve. The head described as fixed is given 1,280 filters for the gated head (List 1) but 100 for cross-attention (List 2), and the DNA upsampling is kernel 3, stride 2, padding 2 in the appendix but kernel 2, stride 2 in Equation 1; the appendix setting places the DNA stream two codons out of register with the protein frame, so Equation 1's is used here. Seeds and the number of runs are not reported. Every value chosen is recorded as an explicit deviation and held fixed through Phase B; no official code repository was verified, so the implementation follows the paper and its supplement.</w:t>
       </w:r>
     </w:p>
     <w:p>
@@ -29459,7 +29459,7 @@
       </w:r>
       <w:r>
         <w:rPr/>
-        <w:t xml:space="preserve">Multiple Instance Learning (MIL) with gated attention (tanh/sigmoid) to produce interpretable, per-sequence modality weights, trained with an entropy regularizer to monitor whether the model relies predominantly on one modality. This is also BioLangFusion's best-performing fusion head, so the reproduction supplies it.</w:t>
+        <w:t>Multiple Instance Learning (MIL) with gated attention (tanh/sigmoid) to produce interpretable, per-sequence modality weights, trained with an entropy regularizer that makes the weights more decisive; the weights show whether the model relies predominantly on one modality. This is also BioLangFusion's best-performing fusion head, so the reproduction supplies it.</w:t>
       </w:r>
     </w:p>
     <w:p>
@@ -34550,7 +34550,7 @@
       <w:proofErr w:type="spellEnd"/>
       <w:r>
         <w:rPr/>
-        <w:t>The next meeting with Mina Basirat is October 20, 2026. She is reviewing the Overleaf manuscript herself, so the meeting is for the important findings and the experimental design, with her research plan's seven items carried out as written, in its order and under its numbers, on top of it (Sections 11 and 12). The deck is a Claude Slides deck with speaker notes on each slide; its .pptx export belongs at docs/notes/Slides/Mina_Meeting_Slides_2026-10-20.pptx.</w:t>
+        <w:t>The next meeting with Mina Basirat is October 22, 2026. She is reviewing the Overleaf manuscript herself, so the meeting is for the important findings and the experimental design, with her research plan's seven items carried out as written, in its order and under its numbers, on top of it (Sections 11 and 12). The deck is a Claude Slides deck with speaker notes on each slide; its .pptx export belongs at docs/notes/Slides/Mina_Meeting_Slides_2026-10-22.pptx.</w:t>
       </w:r>
     </w:p>
     <w:p>

</xml_diff>

<commit_message>
Stage 4 round 1: mRFP control and BioLangFusion Phase A run, Phase B built; sync records, READMEs, Gantt and notes to October 20
Co-Authored-By: Claude Fable 5.1 <noreply@anthropic.com>

Claude-Session: https://claude.ai/code/session_01A54DUp2K2ADqzEJ7zvsPHg
</commit_message>
<xml_diff>
--- a/docs/notes/Mina_Project_Notes.docx
+++ b/docs/notes/Mina_Project_Notes.docx
@@ -479,7 +479,7 @@
       </w:r>
       <w:r>
         <w:rPr/>
-        <w:t>Notebooks 01 to 04 in Code/stage3 ran October 15 to 19: the four BioLangFusion benchmarks with their token-level embeddings; the BioLangFusion model checked on fungal expression (Gantt 17, one benchmark of four so far); LucaOne's input limit measured (41); and IsoFormer's aggregator run on the GTEx pilot with frozen encoders (44). Remaining in the research plan: Phase A on E. coli, CoV-Vac and mRNA stability, then the encoder swaps (24). Coupled Mamba (20, 21) and cross-attention (25) follow, from January.</w:t>
+        <w:t>Notebooks 01 to 04 in Code/stage3 ran October 15 to 19: the four BioLangFusion benchmarks with their token-level embeddings; the codon grid, the three heads and the TextCNN head, checked on fungal expression (Gantt 17); LucaOne's input limit measured (41); IsoFormer's aggregator built and run on the GTEx pilot with frozen encoders (44). The grid was then generalised so any Stage 1 encoder but DNABERT-2 can take any slot (24). Remaining in round 1: the DNABERT-2 grid adapter, LucaOne embeddings, full-transcript inputs for half-life and TE. Coupled Mamba (20, 21) and cross-attention (25) follow, from January.</w:t>
       </w:r>
     </w:p>
     <w:p>
@@ -495,11 +495,11 @@
         <w:rPr>
           <w:b/>
         </w:rPr>
-        <w:t xml:space="preserve">Stage 4 (Overleaf 12; notes 12): planned, not run. </w:t>
+        <w:t xml:space="preserve">Stage 4 (Overleaf 12 and 13; notes 12): first round running. </w:t>
       </w:r>
       <w:r>
         <w:rPr/>
-        <w:t>The research plan first, in its order: baselines with the mRFP control in parallel (16, 18), the BioLangFusion reproduction (17), the encoder swaps (24), LucaOne (41) and IsoFormer (44), half-life and translation efficiency (42, November 23 to December 20); synthesis for the course (29); then the project's designs, Coupled Mamba (20, 21) and cross-attention (25), with the alignment-loss ablation (23), January and February; structure (38) and distillation (43) in March, conditional.</w:t>
+        <w:t>Run: the mRFP control (18, October 19), BioLangFusion Phase A on fungal, CoV-Vac, E. coli and mRNA stability (17, October 17 to 20), IsoFormer on the GTEx pilot (44), LucaOne's feasibility (41). Built, not run: the encoder swaps (24, about 11 GPU hours). Results so far, Overleaf Section 13: the single encoders and cross-attention reproduce the paper; the gated head does not, and its weights show it keeping one modality; fusion beats the best single encoder on E. coli and on GTEx, not on fungal or CoV-Vac, and stability's published split is mostly memorisation (every model drops 0.2 on unseen sequences); on mRFP every nucleotide encoder carries codon information beyond composition, mRNA-FM most. Next: Phase B, the gated head at 1,280 channels, the grouped stability re-split, LucaOne on stability (41), the half-life and TE gate (42, November 23 to December 20); synthesis for the course (29); then the project's designs, Coupled Mamba (20, 21) and cross-attention (25), with the alignment-loss ablation (23), January and February; structure (38) and distillation (43) in March, conditional.</w:t>
       </w:r>
     </w:p>
     <w:p>
@@ -34667,6 +34667,24 @@
     </w:p>
     <w:p>
       <w:pPr>
+        <w:pStyle w:val="ListParagraph"/>
+        <w:spacing w:after="80"/>
+      </w:pPr>
+      <w:proofErr w:type="spellStart"/>
+      <w:proofErr w:type="spellEnd"/>
+      <w:proofErr w:type="spellStart"/>
+      <w:proofErr w:type="spellEnd"/>
+      <w:proofErr w:type="spellStart"/>
+      <w:proofErr w:type="spellEnd"/>
+      <w:proofErr w:type="spellStart"/>
+      <w:proofErr w:type="spellEnd"/>
+      <w:r>
+        <w:rPr/>
+        <w:t>• Results so far, one slide each (Overleaf 13): the BioLangFusion reproduction on four benchmarks, ours beside published, with the bootstrap verdict per benchmark; the gated head's weights as a modality selector; the stability leak (every model drops 0.2 on unseen sequences; fusion ahead on the clean rows); the mRFP control (every nucleotide encoder beats the controls, mRNA-FM by far); IsoFormer with frozen encoders (fusion beats RNA alone, resolved); the tally: fusion wins on E. coli and GTEx, the single encoder on fungal and CoV-Vac.</w:t>
+      </w:r>
+    </w:p>
+    <w:p>
+      <w:pPr>
         <w:spacing w:after="160"/>
       </w:pPr>
       <w:proofErr w:type="spellStart"/>
@@ -34721,7 +34739,7 @@
       <w:proofErr w:type="spellEnd"/>
       <w:r>
         <w:rPr/>
-        <w:t xml:space="preserve">• 2. Phase A without official code: no BioLangFusion repository was verified, so the reproduction follows the paper and supplement. Several details are unreported (TextCNN kernel sizes and filter counts, projection widths, attention heads, maximum epochs, seeds, number of runs). Is a reimplementation with those choices documented as deviations acceptable as the faithful baseline, and which deviations should be flagged before training?</w:t>
+        <w:t>• 2. Phase A results: the single encoders and cross-attention reproduce; the gated head does not, on three of four benchmarks, and its weights show it keeping one modality (RNA at zero everywhere; on CoV-Vac it drops the strongest encoder); the entropy term never helps; fusion beats the best single encoder on E. coli (every head, concatenation by 7 points), loses on CoV-Vac, ties on fungal and on stability's published split. The paper reports no error bars and its stability split repeats training sequences in 68% of test rows. Which of these go into the write-up as findings, and is seeds plus a paired bootstrap the reporting standard for everything that follows?</w:t>
       </w:r>
     </w:p>
     <w:p>
@@ -34757,7 +34775,7 @@
       <w:proofErr w:type="spellEnd"/>
       <w:r>
         <w:rPr/>
-        <w:t xml:space="preserve">• 4. LucaOne truncation: its 1,280-token limit cuts most stability coding sequences and the whole GTEx window. Run on truncated inputs with the truncation reported, or restrict the comparison to sequences that fit?</w:t>
+        <w:t>• 4. LucaOne: its 1,280-token context admits none of the GTEx windows and 40% of transcripts, so a GTEx baseline is ruled out; joint checkpoints exist. Is a stability-only baseline worth 1.8 billion parameters of inference, and on which sequences (those that fit, or truncated with the truncation reported)?</w:t>
       </w:r>
     </w:p>
     <w:p>
@@ -34847,7 +34865,25 @@
       <w:proofErr w:type="spellEnd"/>
       <w:r>
         <w:rPr/>
-        <w:t xml:space="preserve">• 9. Encoder swaps and cluster: swap the RNA encoder first (CaLM, mRNA-FM), then protein, then DNA? Include DNABERT-2 with a token-to-codon adapter? And on the cluster: compiling Coupled Mamba's CUDA kernels (mamba-ssm, causal-conv1d), token-level embeddings for the five BioLangFusion benchmarks and GTEx on scratch, the training cost per BioLangFusion run across seeds, and where LucaOne's 1.8-billion-parameter inference fits.</w:t>
+        <w:t>• 9. Encoder swaps and compute: Phase B is built with eight swaps (NT 500M, HyenaDNA, RiNALMo, mRNA-FM, CaLM, ESM-2 35M and 150M, ProtBERT), one at a time, each beside Stage 1's alignment for the pairs it creates; DNABERT-2 waits for a token-to-codon adapter. It needs about 11 GPU hours; Phase A's stability runs took 19 hours on a laptop. Chase has an NVIDIA GPU, which Coupled Mamba's kernels also need. Is cluster access available as well, and should the swaps run on the GPU while the laptop does the smaller checks?</w:t>
+      </w:r>
+    </w:p>
+    <w:p>
+      <w:pPr>
+        <w:pStyle w:val="ListParagraph"/>
+        <w:spacing w:after="80"/>
+      </w:pPr>
+      <w:proofErr w:type="spellStart"/>
+      <w:proofErr w:type="spellEnd"/>
+      <w:proofErr w:type="spellStart"/>
+      <w:proofErr w:type="spellEnd"/>
+      <w:proofErr w:type="spellStart"/>
+      <w:proofErr w:type="spellEnd"/>
+      <w:proofErr w:type="spellStart"/>
+      <w:proofErr w:type="spellEnd"/>
+      <w:r>
+        <w:rPr/>
+        <w:t>• 10. Ab1, the fifth BioLangFusion benchmark, is not in the public CodonBERT release; the paper sources it to Yazdani-Jahromi et al. (2024, UCF). Can it be obtained, so that Phase A covers all five?</w:t>
       </w:r>
     </w:p>
     <w:sectPr>

</xml_diff>

<commit_message>
Notes: American spelling in the two paragraphs that had it
Co-Authored-By: Claude Opus 5 <noreply@anthropic.com>
Claude-Session: https://claude.ai/code/session_01A54DUp2K2ADqzEJ7zvsPHg
</commit_message>
<xml_diff>
--- a/docs/notes/Mina_Project_Notes.docx
+++ b/docs/notes/Mina_Project_Notes.docx
@@ -479,7 +479,7 @@
       </w:r>
       <w:r>
         <w:rPr/>
-        <w:t>Notebooks 01 to 04 in Code/stage3 ran October 15 to 19: the four BioLangFusion benchmarks with their token-level embeddings; the codon grid, the three heads and the TextCNN head, checked on fungal expression (Gantt 17); LucaOne's input limit measured (41); IsoFormer's aggregator built and run on the GTEx pilot with frozen encoders (44). The grid was then generalised so any Stage 1 encoder but DNABERT-2 can take any slot (24). Remaining in round 1: the DNABERT-2 grid adapter, LucaOne embeddings, full-transcript inputs for half-life and TE. Coupled Mamba (20, 21) and cross-attention (25) follow, from January.</w:t>
+        <w:t>Notebooks 01 to 04 in Code/stage3 ran October 15 to 19: the four BioLangFusion benchmarks with their token-level embeddings; the codon grid, the three heads and the TextCNN head, checked on fungal expression (Gantt 17); LucaOne's input limit measured (41); IsoFormer's aggregator built and run on the GTEx pilot with frozen encoders (44). The grid was then generalized so any Stage 1 encoder but DNABERT-2 can take any slot (24). Remaining in round 1: the DNABERT-2 grid adapter, LucaOne embeddings, full-transcript inputs for half-life and TE. Coupled Mamba (20, 21) and cross-attention (25) follow, from January.</w:t>
       </w:r>
     </w:p>
     <w:p>
@@ -495,7 +495,7 @@
         <w:rPr>
           <w:b/>
         </w:rPr>
-        <w:t>Stage 4 (Overleaf 12 and 13; notes 12): first round running. Run: the mRFP control (18, October 19), BioLangFusion Phase A on fungal, CoV-Vac, E. coli and mRNA stability (17, October 17 to 20), IsoFormer on the GTEx pilot (44), LucaOne's feasibility (41). Built on October 20 and not yet run, one notebook per remaining priority: the encoder swaps on all four benchmarks (24, Phase B, with mRNA stability added because the plan names it), LucaOne frozen on stability with IsoFormer's seeds 1 and 2 (41 and 44), and the half-life and translation-efficiency gate (42). Code/stage4/RUNBOOK.md splits those between the two machines so that nothing is run twice: Chase's GPU takes the training sweeps and the large extractions, the laptop takes the gate and the probe reading. Results so far, Overleaf Section 13: the single encoders and cross-attention reproduce the paper; the gated head does not, and its weights show it keeping one modality; fusion beats the best single encoder on E. coli and on GTEx, not on fungal or CoV-Vac, and stability's published split is mostly memorisation (every model drops 0.2 on unseen sequences); on mRFP every nucleotide encoder carries codon information beyond composition, mRNA-FM most. Next: Phase B, then LucaOne and the gate; the gated head at 1,280 channels and the grouped stability re-split; synthesis for the course (29); then the project's designs, Coupled Mamba (20, 21) and cross-attention (25), with the alignment-loss ablation (23), January and February; structure (38) and distillation (43) in March, conditional.</w:t>
+        <w:t>Stage 4 (Overleaf 12 and 13; notes 12): first round running. Run: the mRFP control (18, October 19), BioLangFusion Phase A on fungal, CoV-Vac, E. coli and mRNA stability (17, October 17 to 20), IsoFormer on the GTEx pilot (44), LucaOne's feasibility (41). Built on October 20 and not yet run, one notebook per remaining priority: the encoder swaps on all four benchmarks (24, Phase B, with mRNA stability added because the plan names it), LucaOne frozen on stability with IsoFormer's seeds 1 and 2 (41 and 44), and the half-life and translation-efficiency gate (42). Code/stage4/RUNBOOK.md splits those between the two machines so that nothing is run twice: Chase's GPU takes the training sweeps and the large extractions, the laptop takes the gate and the probe reading. Results so far, Overleaf Section 13: the single encoders and cross-attention reproduce the paper; the gated head does not, and its weights show it keeping one modality; fusion beats the best single encoder on E. coli and on GTEx, not on fungal or CoV-Vac, and stability's published split is mostly memorization (every model drops 0.2 on unseen sequences); on mRFP every nucleotide encoder carries codon information beyond composition, mRNA-FM most. Next: Phase B, then LucaOne and the gate; the gated head at 1,280 channels and the grouped stability re-split; synthesis for the course (29); then the project's designs, Coupled Mamba (20, 21) and cross-attention (25), with the alignment-loss ablation (23), January and February; structure (38) and distillation (43) in March, conditional.</w:t>
       </w:r>
       <w:r>
         <w:rPr/>

</xml_diff>

<commit_message>
Sync the plan, notes, READMEs and deck to the October 22 results
Phase B's four swaps, LucaOne on stability, and the human half-life and
translation-efficiency probes all have results now, so every document that
described them as unrun has been updated.

The finding that changes the account: putting mRNA-FM in the RNA slot
raises E. coli by eight points as a single encoder, resolved, and the +6.9
fusion gain Phase A measured there falls to +0.3 [-2.9, +3.7]. The clearest
fusion win in the project was fusion compensating for a weak encoder.

Gantt: 41 and 42 move to in progress starting October 22; the Details sheet
records what each produced. Notes: the Stage 4 status paragraph, and
questions 2 and 5 rewritten around the new results. Deck: three new slides
for Phase B, LucaOne and the full-transcript tasks, 13 in all.

Co-Authored-By: Claude Fable 5.1 <noreply@anthropic.com>
Claude-Session: https://claude.ai/code/session_01A54DUp2K2ADqzEJ7zvsPHg
</commit_message>
<xml_diff>
--- a/docs/notes/Mina_Project_Notes.docx
+++ b/docs/notes/Mina_Project_Notes.docx
@@ -495,7 +495,7 @@
         <w:rPr>
           <w:b/>
         </w:rPr>
-        <w:t>Stage 4 (Overleaf 12 and 13; notes 12): first round running. Run: the mRFP control (18, October 19), BioLangFusion Phase A on fungal, CoV-Vac, E. coli and mRNA stability (17, October 17 to 20), IsoFormer on the GTEx pilot (44), LucaOne's feasibility (41). Built on October 20 and not yet run, one notebook per remaining priority: the encoder swaps on all four benchmarks (24, Phase B, with mRNA stability added because the plan names it), LucaOne frozen on stability with IsoFormer's seeds 1 and 2 (41 and 44), and the half-life and translation-efficiency gate (42). Code/stage4/RUNBOOK.md splits those between the two machines so that nothing is run twice: Chase's GPU takes the training sweeps and the large extractions, the laptop takes the gate and the probe reading. Results so far, Overleaf Section 13: the single encoders and cross-attention reproduce the paper; the gated head does not, and its weights show it keeping one modality; fusion beats the best single encoder on E. coli and on GTEx, not on fungal or CoV-Vac, and stability's published split is mostly memorization (every model drops 0.2 on unseen sequences); on mRFP every nucleotide encoder carries codon information beyond composition, mRNA-FM most. Next: Phase B, then LucaOne and the gate; the gated head at 1,280 channels and the grouped stability re-split; synthesis for the course (29); then the project's designs, Coupled Mamba (20, 21) and cross-attention (25), with the alignment-loss ablation (23), January and February; structure (38) and distillation (43) in March, conditional.</w:t>
+        <w:t>Stage 4 (Overleaf 12 and 13; notes 12): first round nearly complete. Run: the mRFP control (18, October 19), BioLangFusion Phase A on fungal, CoV-Vac, E. coli and mRNA stability (17, October 17 to 20), IsoFormer on the GTEx pilot (44), and on October 21 to 22 on Chase's GPU, four of the eight Phase B encoder swaps (24), LucaOne frozen on mRNA stability (41) and the human half-life and translation-efficiency probes behind their gate (42). The headline result of the week is that the encoder matters more than the fusion: putting mRNA-FM in the RNA slot raises E. coli by eight points as a single encoder, resolved, and the +6.9 fusion gain Phase A measured there falls to +0.3 [-2.9, +3.7], which does not resolve. Fusion still wins where the inputs are physically different molecules: GTEx +0.047 resolved, full-transcript half-life +0.053 and translation efficiency +0.030. LucaOne's two streams beat the three BioLangFusion encoders concatenated on stability by +0.092, resolved, though at 1.8B parameters against 108M and on the leaky published split. Still to run: the four remaining swaps plus fungal and stability, seeds on the swap comparisons, the gated head at 1,280 channels, the grouped stability re-split, the mouse half-life and TE scores, and paired intervals for the human ones. Then the project's designs, Coupled Mamba (20, 21) and cross-attention (25), with the alignment-loss ablation (23), January and February; structure (38) and distillation (43) in March, conditional.</w:t>
       </w:r>
       <w:r>
         <w:rPr/>
@@ -34798,7 +34798,7 @@
       <w:proofErr w:type="spellEnd"/>
       <w:r>
         <w:rPr/>
-        <w:t>• 2. Phase A results: the single encoders and cross-attention reproduce; the gated head does not, on three of four benchmarks, and its weights show it keeping one modality (RNA at zero everywhere; on CoV-Vac it drops the strongest encoder); the entropy term never helps; fusion beats the best single encoder on E. coli (every head, concatenation by 7 points), loses on CoV-Vac, ties on fungal and on stability's published split. The paper reports no error bars and its stability split repeats training sequences in 68% of test rows. Which of these go into the write-up as findings, and is seeds plus a paired bootstrap the reporting standard for everything that follows?</w:t>
+        <w:t>• 2. The encoder-choice finding: Phase A measured fusion beating the best single encoder on E. coli by +6.9, resolved. Phase B then put mRNA-FM in the RNA slot, the encoder the mRFP control singled out, and that encoder alone gained eight points while the fusion gain over it fell to +0.3 [-2.9, +3.7]. So on the one benchmark where fusion clearly won, the win was fusion compensating for a weak encoder. Should this become the project's headline, with the method test asking which encoder to pick for a task rather than whether to fuse? It is one seed on two benchmarks so far, so the alternative is to hold it until the remaining swaps and seeds are in.</w:t>
       </w:r>
     </w:p>
     <w:p>
@@ -34852,7 +34852,7 @@
       <w:proofErr w:type="spellEnd"/>
       <w:r>
         <w:rPr/>
-        <w:t>• 5. mRNABench gates, now measured rather than hypothetical: all six datasets carry the per-nucleotide coding-region track, so the coding sequence, the 5' region and the 3' region are recoverable without Ensembl, and the half-life and translation-efficiency sets pass the plan's gate on every count (about 12,900 and 10,300 transcripts, every row with a 5' region, 99.6% and 100% with a 3' region, one gene group each). Two carry caveats: the isoform-resolved ribosome-load set marks no coding region on 15% of its rows, which are non-coding isoforms, and the synthetic LBKWK library has 203 rows, too few to resolve the differences being compared. Keep those two as secondary, or drop them?</w:t>
+        <w:t>• 5. mRNABench, now run on the human sets: the gate passed on all four primary datasets, and the full transcript fused with its protein gains +0.053 on half-life and +0.030 on translation efficiency over the best single encoder, which is the protein in both cases. Two caveats we would like your view on. The encoders only just clear the counted-feature floor: composition of the whole transcript reaches 0.542 and 0.702, and the full-transcript encoder alone is below that on both tasks. And the saved tables keep a mean and standard error over nine splits but no per-split predictions, so these gains have no paired intervals yet. Is it worth rerunning to retain them?</w:t>
       </w:r>
     </w:p>
     <w:p>

</xml_diff>